<commit_message>
finishing delivery from CHAP 2 (notebook updated with output cells and report
</commit_message>
<xml_diff>
--- a/roboticDevelopEnv/work/C6/Chap6AdvanceNotes.docx
+++ b/roboticDevelopEnv/work/C6/Chap6AdvanceNotes.docx
@@ -38,6 +38,9 @@
     </w:p>
     <w:p>
       <w:r>
+        <w:rPr>
+          <w:noProof/>
+        </w:rPr>
         <w:drawing>
           <wp:inline distT="0" distB="0" distL="0" distR="0" wp14:anchorId="052F3775" wp14:editId="1720634F">
             <wp:extent cx="5410200" cy="2608596"/>
@@ -148,6 +151,9 @@
     </w:p>
     <w:p>
       <w:r>
+        <w:rPr>
+          <w:noProof/>
+        </w:rPr>
         <w:lastRenderedPageBreak/>
         <w:drawing>
           <wp:inline distT="0" distB="0" distL="0" distR="0" wp14:anchorId="0F546D3A" wp14:editId="29A05A37">
@@ -544,6 +550,9 @@
     <w:p/>
     <w:p>
       <w:r>
+        <w:rPr>
+          <w:noProof/>
+        </w:rPr>
         <w:lastRenderedPageBreak/>
         <w:drawing>
           <wp:inline distT="0" distB="0" distL="0" distR="0" wp14:anchorId="1C3B79B1" wp14:editId="5692DD6F">
@@ -583,6 +592,8 @@
       </w:r>
     </w:p>
     <w:p/>
+    <w:p/>
+    <w:p/>
     <w:p>
       <w:pPr>
         <w:numPr>
@@ -1100,6 +1111,7 @@
         <w:ind w:left="720"/>
       </w:pPr>
       <w:r>
+        <w:lastRenderedPageBreak/>
         <w:t>reduces uncertainty significantly</w:t>
       </w:r>
     </w:p>
@@ -1124,7 +1136,6 @@
         <w:t>Construct a map of the environment by detecting and localizing landmarks</w:t>
       </w:r>
     </w:p>
-    <w:p/>
     <w:p>
       <w:r>
         <w:tab/>
@@ -2680,6 +2691,7 @@
   <w:style w:type="character" w:default="1" w:styleId="Fuentedeprrafopredeter">
     <w:name w:val="Default Paragraph Font"/>
     <w:uiPriority w:val="1"/>
+    <w:semiHidden/>
     <w:unhideWhenUsed/>
   </w:style>
   <w:style w:type="table" w:default="1" w:styleId="Tablanormal">

</xml_diff>

<commit_message>
finishing advance notes before report upload from chapter 6 part 2
</commit_message>
<xml_diff>
--- a/roboticDevelopEnv/work/C6/Chap6AdvanceNotes.docx
+++ b/roboticDevelopEnv/work/C6/Chap6AdvanceNotes.docx
@@ -1261,56 +1261,2924 @@
         <w:t xml:space="preserve">6.4 Simultaneous Localization and Mapping </w:t>
       </w:r>
     </w:p>
+    <w:p>
+      <w:pPr>
+        <w:rPr>
+          <w:b/>
+          <w:bCs/>
+        </w:rPr>
+      </w:pPr>
+      <w:r>
+        <w:rPr>
+          <w:b/>
+          <w:bCs/>
+        </w:rPr>
+        <w:t>6.4 Simultaneous Localization and Mapping (SLAM)</w:t>
+      </w:r>
+    </w:p>
+    <w:p>
+      <w:pPr>
+        <w:numPr>
+          <w:ilvl w:val="0"/>
+          <w:numId w:val="8"/>
+        </w:numPr>
+        <w:rPr>
+          <w:b/>
+          <w:bCs/>
+          <w:lang w:val="es-ES"/>
+        </w:rPr>
+      </w:pPr>
+      <w:r>
+        <w:rPr>
+          <w:b/>
+          <w:bCs/>
+          <w:lang w:val="es-ES"/>
+        </w:rPr>
+        <w:t>Problema “pollo y huevo”</w:t>
+      </w:r>
+      <w:r>
+        <w:rPr>
+          <w:b/>
+          <w:bCs/>
+          <w:lang w:val="es-ES"/>
+        </w:rPr>
+        <w:br/>
+      </w:r>
+      <w:r>
+        <w:rPr>
+          <w:lang w:val="es-ES"/>
+        </w:rPr>
+        <w:t>Hay que construir un mapa para poder localizarse, y a la vez localizarse para construir el mapa.</w:t>
+      </w:r>
+    </w:p>
+    <w:p>
+      <w:pPr>
+        <w:numPr>
+          <w:ilvl w:val="0"/>
+          <w:numId w:val="8"/>
+        </w:numPr>
+        <w:rPr>
+          <w:b/>
+          <w:bCs/>
+          <w:lang w:val="es-ES"/>
+        </w:rPr>
+      </w:pPr>
+      <w:r>
+        <w:rPr>
+          <w:b/>
+          <w:bCs/>
+          <w:lang w:val="es-ES"/>
+        </w:rPr>
+        <w:t>Vector de estado</w:t>
+      </w:r>
+    </w:p>
+    <w:p>
+      <w:pPr>
+        <w:ind w:left="720"/>
+        <w:rPr>
+          <w:b/>
+          <w:bCs/>
+          <w:lang w:val="es-ES"/>
+        </w:rPr>
+      </w:pPr>
+      <w:r>
+        <w:rPr>
+          <w:b/>
+          <w:bCs/>
+          <w:lang w:val="es-ES"/>
+        </w:rPr>
+        <w:lastRenderedPageBreak/>
+        <w:drawing>
+          <wp:inline distT="0" distB="0" distL="0" distR="0" wp14:anchorId="103B2E02" wp14:editId="4960A9B0">
+            <wp:extent cx="4744112" cy="447737"/>
+            <wp:effectExtent l="0" t="0" r="0" b="9525"/>
+            <wp:docPr id="924049819" name="Imagen 1"/>
+            <wp:cNvGraphicFramePr>
+              <a:graphicFrameLocks xmlns:a="http://schemas.openxmlformats.org/drawingml/2006/main" noChangeAspect="1"/>
+            </wp:cNvGraphicFramePr>
+            <a:graphic xmlns:a="http://schemas.openxmlformats.org/drawingml/2006/main">
+              <a:graphicData uri="http://schemas.openxmlformats.org/drawingml/2006/picture">
+                <pic:pic xmlns:pic="http://schemas.openxmlformats.org/drawingml/2006/picture">
+                  <pic:nvPicPr>
+                    <pic:cNvPr id="924049819" name=""/>
+                    <pic:cNvPicPr/>
+                  </pic:nvPicPr>
+                  <pic:blipFill>
+                    <a:blip r:embed="rId8"/>
+                    <a:stretch>
+                      <a:fillRect/>
+                    </a:stretch>
+                  </pic:blipFill>
+                  <pic:spPr>
+                    <a:xfrm>
+                      <a:off x="0" y="0"/>
+                      <a:ext cx="4744112" cy="447737"/>
+                    </a:xfrm>
+                    <a:prstGeom prst="rect">
+                      <a:avLst/>
+                    </a:prstGeom>
+                  </pic:spPr>
+                </pic:pic>
+              </a:graphicData>
+            </a:graphic>
+          </wp:inline>
+        </w:drawing>
+      </w:r>
+    </w:p>
+    <w:p>
+      <w:pPr>
+        <w:ind w:left="720"/>
+        <w:rPr>
+          <w:lang w:val="es-ES"/>
+        </w:rPr>
+      </w:pPr>
+      <w:r>
+        <w:rPr>
+          <w:lang w:val="es-ES"/>
+        </w:rPr>
+        <w:br/>
+        <w:t xml:space="preserve">• Longitud 2·M + 3, donde M es el número de </w:t>
+      </w:r>
+      <w:proofErr w:type="spellStart"/>
+      <w:r>
+        <w:rPr>
+          <w:lang w:val="es-ES"/>
+        </w:rPr>
+        <w:t>landmarks</w:t>
+      </w:r>
+      <w:proofErr w:type="spellEnd"/>
+      <w:r>
+        <w:rPr>
+          <w:lang w:val="es-ES"/>
+        </w:rPr>
+        <w:t xml:space="preserve"> observados.</w:t>
+      </w:r>
+      <w:r>
+        <w:rPr>
+          <w:lang w:val="es-ES"/>
+        </w:rPr>
+        <w:br/>
+        <w:t xml:space="preserve">• </w:t>
+      </w:r>
+      <w:proofErr w:type="spellStart"/>
+      <w:r>
+        <w:rPr>
+          <w:lang w:val="es-ES"/>
+        </w:rPr>
+        <w:t>x_v</w:t>
+      </w:r>
+      <w:proofErr w:type="spellEnd"/>
+      <w:r>
+        <w:rPr>
+          <w:lang w:val="es-ES"/>
+        </w:rPr>
+        <w:t xml:space="preserve">, </w:t>
+      </w:r>
+      <w:proofErr w:type="spellStart"/>
+      <w:r>
+        <w:rPr>
+          <w:lang w:val="es-ES"/>
+        </w:rPr>
+        <w:t>y_v</w:t>
+      </w:r>
+      <w:proofErr w:type="spellEnd"/>
+      <w:r>
+        <w:rPr>
+          <w:lang w:val="es-ES"/>
+        </w:rPr>
+        <w:t xml:space="preserve">, </w:t>
+      </w:r>
+      <w:r>
+        <w:t>θ</w:t>
+      </w:r>
+      <w:r>
+        <w:rPr>
+          <w:lang w:val="es-ES"/>
+        </w:rPr>
+        <w:t xml:space="preserve">_v: pose del robot; </w:t>
+      </w:r>
+      <w:proofErr w:type="spellStart"/>
+      <w:r>
+        <w:rPr>
+          <w:lang w:val="es-ES"/>
+        </w:rPr>
+        <w:t>x_i</w:t>
+      </w:r>
+      <w:proofErr w:type="spellEnd"/>
+      <w:r>
+        <w:rPr>
+          <w:lang w:val="es-ES"/>
+        </w:rPr>
+        <w:t xml:space="preserve">, </w:t>
+      </w:r>
+      <w:proofErr w:type="spellStart"/>
+      <w:r>
+        <w:rPr>
+          <w:lang w:val="es-ES"/>
+        </w:rPr>
+        <w:t>y_i</w:t>
+      </w:r>
+      <w:proofErr w:type="spellEnd"/>
+      <w:r>
+        <w:rPr>
+          <w:lang w:val="es-ES"/>
+        </w:rPr>
+        <w:t>: posición del i-</w:t>
+      </w:r>
+      <w:proofErr w:type="spellStart"/>
+      <w:r>
+        <w:rPr>
+          <w:lang w:val="es-ES"/>
+        </w:rPr>
+        <w:t>ésimo</w:t>
+      </w:r>
+      <w:proofErr w:type="spellEnd"/>
+      <w:r>
+        <w:rPr>
+          <w:lang w:val="es-ES"/>
+        </w:rPr>
+        <w:t xml:space="preserve"> </w:t>
+      </w:r>
+      <w:proofErr w:type="spellStart"/>
+      <w:r>
+        <w:rPr>
+          <w:lang w:val="es-ES"/>
+        </w:rPr>
+        <w:t>landmark</w:t>
+      </w:r>
+      <w:proofErr w:type="spellEnd"/>
+      <w:r>
+        <w:rPr>
+          <w:lang w:val="es-ES"/>
+        </w:rPr>
+        <w:t>.</w:t>
+      </w:r>
+    </w:p>
+    <w:p>
+      <w:pPr>
+        <w:numPr>
+          <w:ilvl w:val="0"/>
+          <w:numId w:val="8"/>
+        </w:numPr>
+        <w:rPr>
+          <w:b/>
+          <w:bCs/>
+          <w:lang w:val="es-ES"/>
+        </w:rPr>
+      </w:pPr>
+      <w:r>
+        <w:rPr>
+          <w:b/>
+          <w:bCs/>
+          <w:lang w:val="es-ES"/>
+        </w:rPr>
+        <w:t>Matriz de covarianza</w:t>
+      </w:r>
+    </w:p>
+    <w:p>
+      <w:pPr>
+        <w:ind w:left="720"/>
+        <w:rPr>
+          <w:b/>
+          <w:bCs/>
+          <w:lang w:val="es-ES"/>
+        </w:rPr>
+      </w:pPr>
+    </w:p>
+    <w:p>
+      <w:pPr>
+        <w:ind w:left="360"/>
+        <w:rPr>
+          <w:b/>
+          <w:bCs/>
+          <w:lang w:val="es-ES"/>
+        </w:rPr>
+      </w:pPr>
+      <w:r>
+        <w:rPr>
+          <w:b/>
+          <w:bCs/>
+          <w:lang w:val="es-ES"/>
+        </w:rPr>
+        <w:drawing>
+          <wp:inline distT="0" distB="0" distL="0" distR="0" wp14:anchorId="079BD7FD" wp14:editId="72DA5D7E">
+            <wp:extent cx="2905530" cy="647790"/>
+            <wp:effectExtent l="0" t="0" r="9525" b="0"/>
+            <wp:docPr id="1891952221" name="Imagen 1" descr="Imagen que contiene Diagrama&#10;&#10;El contenido generado por IA puede ser incorrecto."/>
+            <wp:cNvGraphicFramePr>
+              <a:graphicFrameLocks xmlns:a="http://schemas.openxmlformats.org/drawingml/2006/main" noChangeAspect="1"/>
+            </wp:cNvGraphicFramePr>
+            <a:graphic xmlns:a="http://schemas.openxmlformats.org/drawingml/2006/main">
+              <a:graphicData uri="http://schemas.openxmlformats.org/drawingml/2006/picture">
+                <pic:pic xmlns:pic="http://schemas.openxmlformats.org/drawingml/2006/picture">
+                  <pic:nvPicPr>
+                    <pic:cNvPr id="1891952221" name="Imagen 1" descr="Imagen que contiene Diagrama&#10;&#10;El contenido generado por IA puede ser incorrecto."/>
+                    <pic:cNvPicPr/>
+                  </pic:nvPicPr>
+                  <pic:blipFill>
+                    <a:blip r:embed="rId9"/>
+                    <a:stretch>
+                      <a:fillRect/>
+                    </a:stretch>
+                  </pic:blipFill>
+                  <pic:spPr>
+                    <a:xfrm>
+                      <a:off x="0" y="0"/>
+                      <a:ext cx="2905530" cy="647790"/>
+                    </a:xfrm>
+                    <a:prstGeom prst="rect">
+                      <a:avLst/>
+                    </a:prstGeom>
+                  </pic:spPr>
+                </pic:pic>
+              </a:graphicData>
+            </a:graphic>
+          </wp:inline>
+        </w:drawing>
+      </w:r>
+    </w:p>
+    <w:p>
+      <w:pPr>
+        <w:rPr>
+          <w:lang w:val="es-ES"/>
+        </w:rPr>
+      </w:pPr>
+      <w:r>
+        <w:rPr>
+          <w:lang w:val="es-ES"/>
+        </w:rPr>
+        <w:br/>
+        <w:t xml:space="preserve">• </w:t>
+      </w:r>
+      <w:proofErr w:type="spellStart"/>
+      <w:r>
+        <w:rPr>
+          <w:lang w:val="es-ES"/>
+        </w:rPr>
+        <w:t>P_vv</w:t>
+      </w:r>
+      <w:proofErr w:type="spellEnd"/>
+      <w:r>
+        <w:rPr>
+          <w:lang w:val="es-ES"/>
+        </w:rPr>
+        <w:t>: 3×3, covarianza de la pose del robot.</w:t>
+      </w:r>
+      <w:r>
+        <w:rPr>
+          <w:lang w:val="es-ES"/>
+        </w:rPr>
+        <w:br/>
+        <w:t xml:space="preserve">• </w:t>
+      </w:r>
+      <w:proofErr w:type="spellStart"/>
+      <w:r>
+        <w:rPr>
+          <w:lang w:val="es-ES"/>
+        </w:rPr>
+        <w:t>P_mm</w:t>
+      </w:r>
+      <w:proofErr w:type="spellEnd"/>
+      <w:r>
+        <w:rPr>
+          <w:lang w:val="es-ES"/>
+        </w:rPr>
+        <w:t>: (2</w:t>
+      </w:r>
+      <w:proofErr w:type="gramStart"/>
+      <w:r>
+        <w:rPr>
+          <w:lang w:val="es-ES"/>
+        </w:rPr>
+        <w:t>M)×</w:t>
+      </w:r>
+      <w:proofErr w:type="gramEnd"/>
+      <w:r>
+        <w:rPr>
+          <w:lang w:val="es-ES"/>
+        </w:rPr>
+        <w:t xml:space="preserve">(2M), covarianza de las posiciones de </w:t>
+      </w:r>
+      <w:proofErr w:type="spellStart"/>
+      <w:r>
+        <w:rPr>
+          <w:lang w:val="es-ES"/>
+        </w:rPr>
+        <w:t>landmarks</w:t>
+      </w:r>
+      <w:proofErr w:type="spellEnd"/>
+      <w:r>
+        <w:rPr>
+          <w:lang w:val="es-ES"/>
+        </w:rPr>
+        <w:t>.</w:t>
+      </w:r>
+      <w:r>
+        <w:rPr>
+          <w:lang w:val="es-ES"/>
+        </w:rPr>
+        <w:br/>
+        <w:t xml:space="preserve">• </w:t>
+      </w:r>
+      <w:proofErr w:type="spellStart"/>
+      <w:r>
+        <w:rPr>
+          <w:lang w:val="es-ES"/>
+        </w:rPr>
+        <w:t>P_vm</w:t>
+      </w:r>
+      <w:proofErr w:type="spellEnd"/>
+      <w:r>
+        <w:rPr>
+          <w:lang w:val="es-ES"/>
+        </w:rPr>
+        <w:t xml:space="preserve"> (3×2M) y </w:t>
+      </w:r>
+      <w:proofErr w:type="spellStart"/>
+      <w:r>
+        <w:rPr>
+          <w:lang w:val="es-ES"/>
+        </w:rPr>
+        <w:t>P_mv</w:t>
+      </w:r>
+      <w:proofErr w:type="spellEnd"/>
+      <w:r>
+        <w:rPr>
+          <w:lang w:val="es-ES"/>
+        </w:rPr>
+        <w:t xml:space="preserve"> (2M×3): correlaciones robot ↔ mapa.</w:t>
+      </w:r>
+    </w:p>
+    <w:p>
+      <w:pPr>
+        <w:rPr>
+          <w:b/>
+          <w:bCs/>
+          <w:lang w:val="es-ES"/>
+        </w:rPr>
+      </w:pPr>
+    </w:p>
+    <w:p>
+      <w:pPr>
+        <w:numPr>
+          <w:ilvl w:val="0"/>
+          <w:numId w:val="10"/>
+        </w:numPr>
+      </w:pPr>
+      <w:proofErr w:type="spellStart"/>
+      <w:r>
+        <w:rPr>
+          <w:b/>
+          <w:bCs/>
+        </w:rPr>
+        <w:t>Filtro</w:t>
+      </w:r>
+      <w:proofErr w:type="spellEnd"/>
+      <w:r>
+        <w:rPr>
+          <w:b/>
+          <w:bCs/>
+        </w:rPr>
+        <w:t xml:space="preserve"> EKF–SLAM</w:t>
+      </w:r>
+    </w:p>
+    <w:p>
+      <w:pPr>
+        <w:numPr>
+          <w:ilvl w:val="1"/>
+          <w:numId w:val="10"/>
+        </w:numPr>
+        <w:rPr>
+          <w:lang w:val="es-ES"/>
+        </w:rPr>
+      </w:pPr>
+      <w:r>
+        <w:rPr>
+          <w:b/>
+          <w:bCs/>
+          <w:lang w:val="es-ES"/>
+        </w:rPr>
+        <w:t>Predicción</w:t>
+      </w:r>
+      <w:r>
+        <w:rPr>
+          <w:lang w:val="es-ES"/>
+        </w:rPr>
+        <w:t xml:space="preserve"> usando el modelo de movimiento (actualiza x y P).</w:t>
+      </w:r>
+    </w:p>
+    <w:p>
+      <w:pPr>
+        <w:numPr>
+          <w:ilvl w:val="1"/>
+          <w:numId w:val="10"/>
+        </w:numPr>
+        <w:rPr>
+          <w:lang w:val="es-ES"/>
+        </w:rPr>
+      </w:pPr>
+      <w:r>
+        <w:rPr>
+          <w:b/>
+          <w:bCs/>
+          <w:lang w:val="es-ES"/>
+        </w:rPr>
+        <w:t>Actualización</w:t>
+      </w:r>
+      <w:r>
+        <w:rPr>
+          <w:lang w:val="es-ES"/>
+        </w:rPr>
+        <w:t xml:space="preserve"> con observaciones (rangos/ángulos), según fórmulas estándar EKF.</w:t>
+      </w:r>
+    </w:p>
+    <w:p>
+      <w:pPr>
+        <w:numPr>
+          <w:ilvl w:val="1"/>
+          <w:numId w:val="10"/>
+        </w:numPr>
+        <w:rPr>
+          <w:lang w:val="es-ES"/>
+        </w:rPr>
+      </w:pPr>
+      <w:r>
+        <w:rPr>
+          <w:b/>
+          <w:bCs/>
+          <w:lang w:val="es-ES"/>
+        </w:rPr>
+        <w:t xml:space="preserve">Inserción de nuevos </w:t>
+      </w:r>
+      <w:proofErr w:type="spellStart"/>
+      <w:r>
+        <w:rPr>
+          <w:b/>
+          <w:bCs/>
+          <w:lang w:val="es-ES"/>
+        </w:rPr>
+        <w:t>landmarks</w:t>
+      </w:r>
+      <w:proofErr w:type="spellEnd"/>
+      <w:r>
+        <w:rPr>
+          <w:lang w:val="es-ES"/>
+        </w:rPr>
+        <w:t xml:space="preserve">: cuando aparece un punto no visto, se extiende x y P usando el jacobiano </w:t>
+      </w:r>
+      <w:r>
+        <w:rPr>
+          <w:lang w:val="es-ES"/>
+        </w:rPr>
+        <w:tab/>
+      </w:r>
+      <w:r>
+        <w:rPr>
+          <w:lang w:val="es-ES"/>
+        </w:rPr>
+        <w:t>de observación.</w:t>
+      </w:r>
+    </w:p>
+    <w:p>
+      <w:pPr>
+        <w:numPr>
+          <w:ilvl w:val="0"/>
+          <w:numId w:val="10"/>
+        </w:numPr>
+        <w:rPr>
+          <w:lang w:val="es-ES"/>
+        </w:rPr>
+      </w:pPr>
+      <w:r>
+        <w:rPr>
+          <w:b/>
+          <w:bCs/>
+          <w:lang w:val="es-ES"/>
+        </w:rPr>
+        <w:t>Alineación mapa ↔ mundo</w:t>
+      </w:r>
+      <w:r>
+        <w:rPr>
+          <w:lang w:val="es-ES"/>
+        </w:rPr>
+        <w:br/>
+        <w:t xml:space="preserve">Una vez finalizado, extraer la matriz de transformación T para superponer la trayectoria estimada y los </w:t>
+      </w:r>
+      <w:proofErr w:type="spellStart"/>
+      <w:r>
+        <w:rPr>
+          <w:lang w:val="es-ES"/>
+        </w:rPr>
+        <w:t>landmarks</w:t>
+      </w:r>
+      <w:proofErr w:type="spellEnd"/>
+      <w:r>
+        <w:rPr>
+          <w:lang w:val="es-ES"/>
+        </w:rPr>
+        <w:t xml:space="preserve"> estimados con los reales.</w:t>
+      </w:r>
+    </w:p>
+    <w:p>
+      <w:pPr>
+        <w:rPr>
+          <w:lang w:val="es-ES"/>
+        </w:rPr>
+      </w:pPr>
+    </w:p>
+    <w:p>
+      <w:pPr>
+        <w:rPr>
+          <w:lang w:val="es-ES"/>
+        </w:rPr>
+      </w:pPr>
+      <w:r>
+        <w:rPr>
+          <w:lang w:val="es-ES"/>
+        </w:rPr>
+        <w:lastRenderedPageBreak/>
+        <w:drawing>
+          <wp:inline distT="0" distB="0" distL="0" distR="0" wp14:anchorId="56B346FC" wp14:editId="3342D2A3">
+            <wp:extent cx="5731510" cy="5351780"/>
+            <wp:effectExtent l="0" t="0" r="2540" b="1270"/>
+            <wp:docPr id="1212479164" name="Imagen 1" descr="Interfaz de usuario gráfica, Gráfico&#10;&#10;El contenido generado por IA puede ser incorrecto."/>
+            <wp:cNvGraphicFramePr>
+              <a:graphicFrameLocks xmlns:a="http://schemas.openxmlformats.org/drawingml/2006/main" noChangeAspect="1"/>
+            </wp:cNvGraphicFramePr>
+            <a:graphic xmlns:a="http://schemas.openxmlformats.org/drawingml/2006/main">
+              <a:graphicData uri="http://schemas.openxmlformats.org/drawingml/2006/picture">
+                <pic:pic xmlns:pic="http://schemas.openxmlformats.org/drawingml/2006/picture">
+                  <pic:nvPicPr>
+                    <pic:cNvPr id="1212479164" name="Imagen 1" descr="Interfaz de usuario gráfica, Gráfico&#10;&#10;El contenido generado por IA puede ser incorrecto."/>
+                    <pic:cNvPicPr/>
+                  </pic:nvPicPr>
+                  <pic:blipFill>
+                    <a:blip r:embed="rId10"/>
+                    <a:stretch>
+                      <a:fillRect/>
+                    </a:stretch>
+                  </pic:blipFill>
+                  <pic:spPr>
+                    <a:xfrm>
+                      <a:off x="0" y="0"/>
+                      <a:ext cx="5731510" cy="5351780"/>
+                    </a:xfrm>
+                    <a:prstGeom prst="rect">
+                      <a:avLst/>
+                    </a:prstGeom>
+                  </pic:spPr>
+                </pic:pic>
+              </a:graphicData>
+            </a:graphic>
+          </wp:inline>
+        </w:drawing>
+      </w:r>
+    </w:p>
+    <w:p>
+      <w:pPr>
+        <w:numPr>
+          <w:ilvl w:val="0"/>
+          <w:numId w:val="10"/>
+        </w:numPr>
+      </w:pPr>
+      <w:proofErr w:type="spellStart"/>
+      <w:r>
+        <w:rPr>
+          <w:b/>
+          <w:bCs/>
+        </w:rPr>
+        <w:t>Evolución</w:t>
+      </w:r>
+      <w:proofErr w:type="spellEnd"/>
+      <w:r>
+        <w:rPr>
+          <w:b/>
+          <w:bCs/>
+        </w:rPr>
+        <w:t xml:space="preserve"> de la </w:t>
+      </w:r>
+      <w:proofErr w:type="spellStart"/>
+      <w:r>
+        <w:rPr>
+          <w:b/>
+          <w:bCs/>
+        </w:rPr>
+        <w:t>incertidumbre</w:t>
+      </w:r>
+      <w:proofErr w:type="spellEnd"/>
+    </w:p>
+    <w:p>
+      <w:pPr>
+        <w:numPr>
+          <w:ilvl w:val="1"/>
+          <w:numId w:val="11"/>
+        </w:numPr>
+        <w:rPr>
+          <w:lang w:val="es-ES"/>
+        </w:rPr>
+      </w:pPr>
+      <w:r>
+        <w:rPr>
+          <w:lang w:val="es-ES"/>
+        </w:rPr>
+        <w:t>Con cada observación, la incertidumbre global (traza de P) disminuye.</w:t>
+      </w:r>
+    </w:p>
+    <w:p>
+      <w:pPr>
+        <w:numPr>
+          <w:ilvl w:val="1"/>
+          <w:numId w:val="11"/>
+        </w:numPr>
+        <w:rPr>
+          <w:lang w:val="es-ES"/>
+        </w:rPr>
+      </w:pPr>
+      <w:r>
+        <w:rPr>
+          <w:lang w:val="es-ES"/>
+        </w:rPr>
+        <w:t xml:space="preserve">P deja de ser bloque-diagonal: aparecen correlaciones entre </w:t>
+      </w:r>
+      <w:proofErr w:type="spellStart"/>
+      <w:r>
+        <w:rPr>
+          <w:lang w:val="es-ES"/>
+        </w:rPr>
+        <w:t>landmarks</w:t>
+      </w:r>
+      <w:proofErr w:type="spellEnd"/>
+      <w:r>
+        <w:rPr>
+          <w:lang w:val="es-ES"/>
+        </w:rPr>
+        <w:t>.</w:t>
+      </w:r>
+    </w:p>
+    <w:p>
+      <w:pPr>
+        <w:rPr>
+          <w:lang w:val="es-ES"/>
+        </w:rPr>
+      </w:pPr>
+    </w:p>
+    <w:p>
+      <w:pPr>
+        <w:rPr>
+          <w:lang w:val="es-ES"/>
+        </w:rPr>
+      </w:pPr>
+      <w:r>
+        <w:rPr>
+          <w:lang w:val="es-ES"/>
+        </w:rPr>
+        <w:lastRenderedPageBreak/>
+        <w:drawing>
+          <wp:inline distT="0" distB="0" distL="0" distR="0" wp14:anchorId="050A37FE" wp14:editId="0E1B5E33">
+            <wp:extent cx="4296375" cy="3410426"/>
+            <wp:effectExtent l="0" t="0" r="9525" b="0"/>
+            <wp:docPr id="611362084" name="Imagen 1" descr="Gráfico, Gráfico de líneas&#10;&#10;El contenido generado por IA puede ser incorrecto."/>
+            <wp:cNvGraphicFramePr>
+              <a:graphicFrameLocks xmlns:a="http://schemas.openxmlformats.org/drawingml/2006/main" noChangeAspect="1"/>
+            </wp:cNvGraphicFramePr>
+            <a:graphic xmlns:a="http://schemas.openxmlformats.org/drawingml/2006/main">
+              <a:graphicData uri="http://schemas.openxmlformats.org/drawingml/2006/picture">
+                <pic:pic xmlns:pic="http://schemas.openxmlformats.org/drawingml/2006/picture">
+                  <pic:nvPicPr>
+                    <pic:cNvPr id="611362084" name="Imagen 1" descr="Gráfico, Gráfico de líneas&#10;&#10;El contenido generado por IA puede ser incorrecto."/>
+                    <pic:cNvPicPr/>
+                  </pic:nvPicPr>
+                  <pic:blipFill>
+                    <a:blip r:embed="rId11"/>
+                    <a:stretch>
+                      <a:fillRect/>
+                    </a:stretch>
+                  </pic:blipFill>
+                  <pic:spPr>
+                    <a:xfrm>
+                      <a:off x="0" y="0"/>
+                      <a:ext cx="4296375" cy="3410426"/>
+                    </a:xfrm>
+                    <a:prstGeom prst="rect">
+                      <a:avLst/>
+                    </a:prstGeom>
+                  </pic:spPr>
+                </pic:pic>
+              </a:graphicData>
+            </a:graphic>
+          </wp:inline>
+        </w:drawing>
+      </w:r>
+    </w:p>
+    <w:p>
+      <w:pPr>
+        <w:numPr>
+          <w:ilvl w:val="0"/>
+          <w:numId w:val="10"/>
+        </w:numPr>
+      </w:pPr>
+      <w:proofErr w:type="spellStart"/>
+      <w:r>
+        <w:rPr>
+          <w:b/>
+          <w:bCs/>
+        </w:rPr>
+        <w:t>Limitaciones</w:t>
+      </w:r>
+      <w:proofErr w:type="spellEnd"/>
+      <w:r>
+        <w:rPr>
+          <w:b/>
+          <w:bCs/>
+        </w:rPr>
+        <w:t xml:space="preserve"> del EKF-SLAM</w:t>
+      </w:r>
+    </w:p>
+    <w:p>
+      <w:pPr>
+        <w:numPr>
+          <w:ilvl w:val="1"/>
+          <w:numId w:val="10"/>
+        </w:numPr>
+        <w:rPr>
+          <w:lang w:val="es-ES"/>
+        </w:rPr>
+      </w:pPr>
+      <w:r>
+        <w:rPr>
+          <w:lang w:val="es-ES"/>
+        </w:rPr>
+        <w:t xml:space="preserve">Complejidad cuadrática en M (número de </w:t>
+      </w:r>
+      <w:proofErr w:type="spellStart"/>
+      <w:r>
+        <w:rPr>
+          <w:lang w:val="es-ES"/>
+        </w:rPr>
+        <w:t>landmarks</w:t>
+      </w:r>
+      <w:proofErr w:type="spellEnd"/>
+      <w:r>
+        <w:rPr>
+          <w:lang w:val="es-ES"/>
+        </w:rPr>
+        <w:t>).</w:t>
+      </w:r>
+    </w:p>
+    <w:p>
+      <w:pPr>
+        <w:numPr>
+          <w:ilvl w:val="1"/>
+          <w:numId w:val="10"/>
+        </w:numPr>
+        <w:rPr>
+          <w:lang w:val="es-ES"/>
+        </w:rPr>
+      </w:pPr>
+      <w:r>
+        <w:rPr>
+          <w:lang w:val="es-ES"/>
+        </w:rPr>
+        <w:t xml:space="preserve">Supone errores gaussianos (no siempre realista para sensores como </w:t>
+      </w:r>
+      <w:proofErr w:type="spellStart"/>
+      <w:r>
+        <w:rPr>
+          <w:lang w:val="es-ES"/>
+        </w:rPr>
+        <w:t>Lidar</w:t>
+      </w:r>
+      <w:proofErr w:type="spellEnd"/>
+      <w:r>
+        <w:rPr>
+          <w:lang w:val="es-ES"/>
+        </w:rPr>
+        <w:t>).</w:t>
+      </w:r>
+    </w:p>
+    <w:p>
+      <w:pPr>
+        <w:numPr>
+          <w:ilvl w:val="1"/>
+          <w:numId w:val="10"/>
+        </w:numPr>
+        <w:rPr>
+          <w:lang w:val="es-ES"/>
+        </w:rPr>
+      </w:pPr>
+      <w:r>
+        <w:rPr>
+          <w:lang w:val="es-ES"/>
+        </w:rPr>
+        <w:t xml:space="preserve">Requiere conocer bien las covarianzas de ruido de </w:t>
+      </w:r>
+      <w:proofErr w:type="spellStart"/>
+      <w:r>
+        <w:rPr>
+          <w:lang w:val="es-ES"/>
+        </w:rPr>
+        <w:t>odometría</w:t>
+      </w:r>
+      <w:proofErr w:type="spellEnd"/>
+      <w:r>
+        <w:rPr>
+          <w:lang w:val="es-ES"/>
+        </w:rPr>
+        <w:t xml:space="preserve"> y sensores.</w:t>
+      </w:r>
+    </w:p>
+    <w:p>
+      <w:pPr>
+        <w:rPr>
+          <w:lang w:val="es-ES"/>
+        </w:rPr>
+      </w:pPr>
+      <w:r>
+        <w:rPr>
+          <w:lang w:val="es-ES"/>
+        </w:rPr>
+        <w:drawing>
+          <wp:inline distT="0" distB="0" distL="0" distR="0" wp14:anchorId="28EFE5FE" wp14:editId="2453B4C1">
+            <wp:extent cx="3696216" cy="781159"/>
+            <wp:effectExtent l="0" t="0" r="0" b="0"/>
+            <wp:docPr id="1780823323" name="Imagen 1" descr="Texto&#10;&#10;El contenido generado por IA puede ser incorrecto."/>
+            <wp:cNvGraphicFramePr>
+              <a:graphicFrameLocks xmlns:a="http://schemas.openxmlformats.org/drawingml/2006/main" noChangeAspect="1"/>
+            </wp:cNvGraphicFramePr>
+            <a:graphic xmlns:a="http://schemas.openxmlformats.org/drawingml/2006/main">
+              <a:graphicData uri="http://schemas.openxmlformats.org/drawingml/2006/picture">
+                <pic:pic xmlns:pic="http://schemas.openxmlformats.org/drawingml/2006/picture">
+                  <pic:nvPicPr>
+                    <pic:cNvPr id="1780823323" name="Imagen 1" descr="Texto&#10;&#10;El contenido generado por IA puede ser incorrecto."/>
+                    <pic:cNvPicPr/>
+                  </pic:nvPicPr>
+                  <pic:blipFill>
+                    <a:blip r:embed="rId12"/>
+                    <a:stretch>
+                      <a:fillRect/>
+                    </a:stretch>
+                  </pic:blipFill>
+                  <pic:spPr>
+                    <a:xfrm>
+                      <a:off x="0" y="0"/>
+                      <a:ext cx="3696216" cy="781159"/>
+                    </a:xfrm>
+                    <a:prstGeom prst="rect">
+                      <a:avLst/>
+                    </a:prstGeom>
+                  </pic:spPr>
+                </pic:pic>
+              </a:graphicData>
+            </a:graphic>
+          </wp:inline>
+        </w:drawing>
+      </w:r>
+    </w:p>
+    <w:p>
+      <w:pPr>
+        <w:rPr>
+          <w:lang w:val="es-ES"/>
+        </w:rPr>
+      </w:pPr>
+      <w:proofErr w:type="spellStart"/>
+      <w:r>
+        <w:rPr>
+          <w:lang w:val="es-ES"/>
+        </w:rPr>
+        <w:t>Transformacion</w:t>
+      </w:r>
+      <w:proofErr w:type="spellEnd"/>
+      <w:r>
+        <w:rPr>
+          <w:lang w:val="es-ES"/>
+        </w:rPr>
+        <w:t xml:space="preserve"> del marco del mapa usando funciones especiales </w:t>
+      </w:r>
+      <w:proofErr w:type="gramStart"/>
+      <w:r>
+        <w:rPr>
+          <w:lang w:val="es-ES"/>
+        </w:rPr>
+        <w:t>SE(</w:t>
+      </w:r>
+      <w:proofErr w:type="gramEnd"/>
+      <w:r>
+        <w:rPr>
+          <w:lang w:val="es-ES"/>
+        </w:rPr>
+        <w:t>2) al marco del mundo</w:t>
+      </w:r>
+    </w:p>
+    <w:p>
+      <w:pPr>
+        <w:rPr>
+          <w:lang w:val="es-ES"/>
+        </w:rPr>
+      </w:pPr>
+      <w:r>
+        <w:rPr>
+          <w:lang w:val="es-ES"/>
+        </w:rPr>
+        <w:lastRenderedPageBreak/>
+        <w:drawing>
+          <wp:inline distT="0" distB="0" distL="0" distR="0" wp14:anchorId="36BC8555" wp14:editId="216940FA">
+            <wp:extent cx="3543795" cy="3877216"/>
+            <wp:effectExtent l="0" t="0" r="0" b="0"/>
+            <wp:docPr id="1467263471" name="Imagen 1" descr="Gráfico&#10;&#10;El contenido generado por IA puede ser incorrecto."/>
+            <wp:cNvGraphicFramePr>
+              <a:graphicFrameLocks xmlns:a="http://schemas.openxmlformats.org/drawingml/2006/main" noChangeAspect="1"/>
+            </wp:cNvGraphicFramePr>
+            <a:graphic xmlns:a="http://schemas.openxmlformats.org/drawingml/2006/main">
+              <a:graphicData uri="http://schemas.openxmlformats.org/drawingml/2006/picture">
+                <pic:pic xmlns:pic="http://schemas.openxmlformats.org/drawingml/2006/picture">
+                  <pic:nvPicPr>
+                    <pic:cNvPr id="1467263471" name="Imagen 1" descr="Gráfico&#10;&#10;El contenido generado por IA puede ser incorrecto."/>
+                    <pic:cNvPicPr/>
+                  </pic:nvPicPr>
+                  <pic:blipFill>
+                    <a:blip r:embed="rId13"/>
+                    <a:stretch>
+                      <a:fillRect/>
+                    </a:stretch>
+                  </pic:blipFill>
+                  <pic:spPr>
+                    <a:xfrm>
+                      <a:off x="0" y="0"/>
+                      <a:ext cx="3543795" cy="3877216"/>
+                    </a:xfrm>
+                    <a:prstGeom prst="rect">
+                      <a:avLst/>
+                    </a:prstGeom>
+                  </pic:spPr>
+                </pic:pic>
+              </a:graphicData>
+            </a:graphic>
+          </wp:inline>
+        </w:drawing>
+      </w:r>
+    </w:p>
+    <w:p>
+      <w:pPr>
+        <w:rPr>
+          <w:lang w:val="es-ES"/>
+        </w:rPr>
+      </w:pPr>
+    </w:p>
+    <w:p>
+      <w:pPr>
+        <w:rPr>
+          <w:lang w:val="es-ES"/>
+        </w:rPr>
+      </w:pPr>
+      <w:proofErr w:type="spellStart"/>
+      <w:r>
+        <w:rPr>
+          <w:lang w:val="es-ES"/>
+        </w:rPr>
+        <w:t>Relacion</w:t>
+      </w:r>
+      <w:proofErr w:type="spellEnd"/>
+      <w:r>
+        <w:rPr>
+          <w:lang w:val="es-ES"/>
+        </w:rPr>
+        <w:t xml:space="preserve"> de covarianza con el tiempo y una matriz de covarianzas</w:t>
+      </w:r>
+      <w:r>
+        <w:rPr>
+          <w:lang w:val="es-ES"/>
+        </w:rPr>
+        <w:t xml:space="preserve"> finales a manera de</w:t>
+      </w:r>
+      <w:r>
+        <w:rPr>
+          <w:lang w:val="es-ES"/>
+        </w:rPr>
+        <w:t xml:space="preserve"> mapa de calor. </w:t>
+      </w:r>
+    </w:p>
+    <w:p>
+      <w:pPr>
+        <w:rPr>
+          <w:lang w:val="es-ES"/>
+        </w:rPr>
+      </w:pPr>
+    </w:p>
+    <w:p>
+      <w:pPr>
+        <w:rPr>
+          <w:lang w:val="es-ES"/>
+        </w:rPr>
+      </w:pPr>
+      <w:r>
+        <w:rPr>
+          <w:lang w:val="es-ES"/>
+        </w:rPr>
+        <w:t xml:space="preserve">6.8 </w:t>
+      </w:r>
+      <w:proofErr w:type="spellStart"/>
+      <w:r>
+        <w:rPr>
+          <w:lang w:val="es-ES"/>
+        </w:rPr>
+        <w:t>Application</w:t>
+      </w:r>
+      <w:proofErr w:type="spellEnd"/>
+      <w:r>
+        <w:rPr>
+          <w:lang w:val="es-ES"/>
+        </w:rPr>
+        <w:t xml:space="preserve">: </w:t>
+      </w:r>
+      <w:proofErr w:type="spellStart"/>
+      <w:r>
+        <w:rPr>
+          <w:lang w:val="es-ES"/>
+        </w:rPr>
+        <w:t>Lidar</w:t>
+      </w:r>
+      <w:proofErr w:type="spellEnd"/>
+      <w:r>
+        <w:rPr>
+          <w:lang w:val="es-ES"/>
+        </w:rPr>
+        <w:t xml:space="preserve"> </w:t>
+      </w:r>
+    </w:p>
+    <w:p>
+      <w:pPr>
+        <w:rPr>
+          <w:lang w:val="es-ES"/>
+        </w:rPr>
+      </w:pPr>
+    </w:p>
+    <w:p>
+      <w:pPr>
+        <w:rPr>
+          <w:lang w:val="es-ES"/>
+        </w:rPr>
+      </w:pPr>
+      <w:r>
+        <w:rPr>
+          <w:b/>
+          <w:bCs/>
+          <w:lang w:val="es-ES"/>
+        </w:rPr>
+        <w:t>Objetivo</w:t>
+      </w:r>
+      <w:r>
+        <w:rPr>
+          <w:lang w:val="es-ES"/>
+        </w:rPr>
+        <w:br/>
+        <w:t>Incorporar un sensor de distancia angular para apoyar la localización y el SLAM.</w:t>
+      </w:r>
+    </w:p>
+    <w:p>
+      <w:pPr>
+        <w:rPr>
+          <w:lang w:val="es-ES"/>
+        </w:rPr>
+      </w:pPr>
+      <w:r>
+        <w:rPr>
+          <w:b/>
+          <w:bCs/>
+          <w:lang w:val="es-ES"/>
+        </w:rPr>
+        <w:t>Principio de funcionamiento</w:t>
+      </w:r>
+      <w:r>
+        <w:rPr>
+          <w:lang w:val="es-ES"/>
+        </w:rPr>
+        <w:br/>
+        <w:t xml:space="preserve">El </w:t>
+      </w:r>
+      <w:proofErr w:type="spellStart"/>
+      <w:r>
+        <w:rPr>
+          <w:lang w:val="es-ES"/>
+        </w:rPr>
+        <w:t>lidar</w:t>
+      </w:r>
+      <w:proofErr w:type="spellEnd"/>
+      <w:r>
+        <w:rPr>
+          <w:lang w:val="es-ES"/>
+        </w:rPr>
+        <w:t xml:space="preserve"> emite pulsos de luz láser infrarroja y mide el tiempo que tarda el eco en volver.</w:t>
+      </w:r>
+      <w:r>
+        <w:rPr>
+          <w:lang w:val="es-ES"/>
+        </w:rPr>
+        <w:br/>
+        <w:t>• Tiempo de vuelo → distancia.</w:t>
+      </w:r>
+      <w:r>
+        <w:rPr>
+          <w:lang w:val="es-ES"/>
+        </w:rPr>
+        <w:br/>
+        <w:t>• Dirección del haz → ángulo.</w:t>
+      </w:r>
+    </w:p>
+    <w:p>
+      <w:pPr>
+        <w:rPr>
+          <w:lang w:val="es-ES"/>
+        </w:rPr>
+      </w:pPr>
+      <w:r>
+        <w:rPr>
+          <w:b/>
+          <w:bCs/>
+          <w:lang w:val="es-ES"/>
+        </w:rPr>
+        <w:t>Rango y precisión</w:t>
+      </w:r>
+      <w:r>
+        <w:rPr>
+          <w:lang w:val="es-ES"/>
+        </w:rPr>
+        <w:br/>
+        <w:t>• Alcance típico: hasta 100 m.</w:t>
+      </w:r>
+      <w:r>
+        <w:rPr>
+          <w:lang w:val="es-ES"/>
+        </w:rPr>
+        <w:br/>
+        <w:t>• Precisión: del orden de centímetros.</w:t>
+      </w:r>
+    </w:p>
+    <w:p>
+      <w:pPr>
+        <w:rPr>
+          <w:lang w:val="es-ES"/>
+        </w:rPr>
+      </w:pPr>
+      <w:r>
+        <w:rPr>
+          <w:lang w:val="es-ES"/>
+        </w:rPr>
+        <w:t xml:space="preserve"> </w:t>
+      </w:r>
+      <w:r>
+        <w:rPr>
+          <w:b/>
+          <w:bCs/>
+          <w:lang w:val="es-ES"/>
+        </w:rPr>
+        <w:t xml:space="preserve">Tipos de </w:t>
+      </w:r>
+      <w:proofErr w:type="spellStart"/>
+      <w:r>
+        <w:rPr>
+          <w:b/>
+          <w:bCs/>
+          <w:lang w:val="es-ES"/>
+        </w:rPr>
+        <w:t>lidar</w:t>
+      </w:r>
+      <w:proofErr w:type="spellEnd"/>
+      <w:r>
+        <w:rPr>
+          <w:b/>
+          <w:bCs/>
+          <w:lang w:val="es-ES"/>
+        </w:rPr>
+        <w:t xml:space="preserve"> según configuración</w:t>
+      </w:r>
+    </w:p>
+    <w:p>
+      <w:pPr>
+        <w:numPr>
+          <w:ilvl w:val="0"/>
+          <w:numId w:val="12"/>
+        </w:numPr>
+      </w:pPr>
+      <w:r>
+        <w:rPr>
+          <w:b/>
+          <w:bCs/>
+        </w:rPr>
+        <w:t>1D-lidar</w:t>
+      </w:r>
+    </w:p>
+    <w:p>
+      <w:pPr>
+        <w:numPr>
+          <w:ilvl w:val="1"/>
+          <w:numId w:val="12"/>
+        </w:numPr>
+      </w:pPr>
+      <w:r>
+        <w:lastRenderedPageBreak/>
+        <w:t xml:space="preserve">Un solo </w:t>
+      </w:r>
+      <w:proofErr w:type="spellStart"/>
+      <w:r>
+        <w:t>haz</w:t>
+      </w:r>
+      <w:proofErr w:type="spellEnd"/>
+      <w:r>
+        <w:t>.</w:t>
+      </w:r>
+    </w:p>
+    <w:p>
+      <w:pPr>
+        <w:numPr>
+          <w:ilvl w:val="1"/>
+          <w:numId w:val="12"/>
+        </w:numPr>
+        <w:rPr>
+          <w:lang w:val="es-ES"/>
+        </w:rPr>
+      </w:pPr>
+      <w:r>
+        <w:rPr>
+          <w:lang w:val="es-ES"/>
+        </w:rPr>
+        <w:t xml:space="preserve">Mide r </w:t>
+      </w:r>
+      <w:r>
+        <w:rPr>
+          <w:rFonts w:ascii="Cambria Math" w:hAnsi="Cambria Math" w:cs="Cambria Math"/>
+          <w:lang w:val="es-ES"/>
+        </w:rPr>
+        <w:t>∈</w:t>
+      </w:r>
+      <w:r>
+        <w:rPr>
+          <w:lang w:val="es-ES"/>
+        </w:rPr>
+        <w:t xml:space="preserve"> R (distancia al primer objeto).</w:t>
+      </w:r>
+    </w:p>
+    <w:p>
+      <w:pPr>
+        <w:numPr>
+          <w:ilvl w:val="0"/>
+          <w:numId w:val="12"/>
+        </w:numPr>
+      </w:pPr>
+      <w:r>
+        <w:rPr>
+          <w:b/>
+          <w:bCs/>
+        </w:rPr>
+        <w:t>2D-lidar</w:t>
+      </w:r>
+    </w:p>
+    <w:p>
+      <w:pPr>
+        <w:numPr>
+          <w:ilvl w:val="1"/>
+          <w:numId w:val="12"/>
+        </w:numPr>
+        <w:rPr>
+          <w:lang w:val="es-ES"/>
+        </w:rPr>
+      </w:pPr>
+      <w:r>
+        <w:rPr>
+          <w:lang w:val="es-ES"/>
+        </w:rPr>
+        <w:t>Un haz 1D montado en un motor giratorio.</w:t>
+      </w:r>
+    </w:p>
+    <w:p>
+      <w:pPr>
+        <w:numPr>
+          <w:ilvl w:val="1"/>
+          <w:numId w:val="12"/>
+        </w:numPr>
+        <w:rPr>
+          <w:lang w:val="es-ES"/>
+        </w:rPr>
+      </w:pPr>
+      <w:r>
+        <w:rPr>
+          <w:lang w:val="es-ES"/>
+        </w:rPr>
+        <w:t xml:space="preserve">Barrido en un plano: devuelve (r, </w:t>
+      </w:r>
+      <w:r>
+        <w:t>θ</w:t>
+      </w:r>
+      <w:r>
+        <w:rPr>
+          <w:lang w:val="es-ES"/>
+        </w:rPr>
+        <w:t>) para cada pulso.</w:t>
+      </w:r>
+    </w:p>
+    <w:p>
+      <w:pPr>
+        <w:numPr>
+          <w:ilvl w:val="0"/>
+          <w:numId w:val="12"/>
+        </w:numPr>
+      </w:pPr>
+      <w:r>
+        <w:rPr>
+          <w:b/>
+          <w:bCs/>
+        </w:rPr>
+        <w:t>3D-lidar</w:t>
+      </w:r>
+    </w:p>
+    <w:p>
+      <w:pPr>
+        <w:numPr>
+          <w:ilvl w:val="1"/>
+          <w:numId w:val="12"/>
+        </w:numPr>
+        <w:rPr>
+          <w:lang w:val="es-ES"/>
+        </w:rPr>
+      </w:pPr>
+      <w:r>
+        <w:rPr>
+          <w:lang w:val="es-ES"/>
+        </w:rPr>
+        <w:t>Varias filas de haces 1D en un cabezal giratorio.</w:t>
+      </w:r>
+    </w:p>
+    <w:p>
+      <w:pPr>
+        <w:numPr>
+          <w:ilvl w:val="1"/>
+          <w:numId w:val="12"/>
+        </w:numPr>
+        <w:rPr>
+          <w:lang w:val="es-ES"/>
+        </w:rPr>
+      </w:pPr>
+      <w:r>
+        <w:rPr>
+          <w:lang w:val="es-ES"/>
+        </w:rPr>
+        <w:t>Genera nube de puntos 3D en R³.</w:t>
+      </w:r>
+    </w:p>
+    <w:p>
+      <w:r>
+        <w:t xml:space="preserve"> </w:t>
+      </w:r>
+      <w:proofErr w:type="spellStart"/>
+      <w:r>
+        <w:rPr>
+          <w:b/>
+          <w:bCs/>
+        </w:rPr>
+        <w:t>Ventajas</w:t>
+      </w:r>
+      <w:proofErr w:type="spellEnd"/>
+    </w:p>
+    <w:p>
+      <w:pPr>
+        <w:numPr>
+          <w:ilvl w:val="0"/>
+          <w:numId w:val="13"/>
+        </w:numPr>
+        <w:rPr>
+          <w:lang w:val="es-ES"/>
+        </w:rPr>
+      </w:pPr>
+      <w:r>
+        <w:rPr>
+          <w:lang w:val="es-ES"/>
+        </w:rPr>
+        <w:t>Obtiene datos métricos reales (distancia en metros).</w:t>
+      </w:r>
+    </w:p>
+    <w:p>
+      <w:pPr>
+        <w:numPr>
+          <w:ilvl w:val="0"/>
+          <w:numId w:val="13"/>
+        </w:numPr>
+      </w:pPr>
+      <w:proofErr w:type="spellStart"/>
+      <w:r>
+        <w:t>Funciona</w:t>
+      </w:r>
+      <w:proofErr w:type="spellEnd"/>
+      <w:r>
+        <w:t xml:space="preserve"> </w:t>
+      </w:r>
+      <w:proofErr w:type="spellStart"/>
+      <w:r>
+        <w:t>en</w:t>
+      </w:r>
+      <w:proofErr w:type="spellEnd"/>
+      <w:r>
+        <w:t xml:space="preserve"> </w:t>
+      </w:r>
+      <w:proofErr w:type="spellStart"/>
+      <w:r>
+        <w:t>completa</w:t>
+      </w:r>
+      <w:proofErr w:type="spellEnd"/>
+      <w:r>
+        <w:t xml:space="preserve"> </w:t>
+      </w:r>
+      <w:proofErr w:type="spellStart"/>
+      <w:r>
+        <w:t>oscuridad</w:t>
+      </w:r>
+      <w:proofErr w:type="spellEnd"/>
+      <w:r>
+        <w:t>.</w:t>
+      </w:r>
+    </w:p>
+    <w:p>
+      <w:pPr>
+        <w:numPr>
+          <w:ilvl w:val="0"/>
+          <w:numId w:val="13"/>
+        </w:numPr>
+      </w:pPr>
+      <w:r>
+        <w:t xml:space="preserve">Alta </w:t>
+      </w:r>
+      <w:proofErr w:type="spellStart"/>
+      <w:r>
+        <w:t>repetibilidad</w:t>
+      </w:r>
+      <w:proofErr w:type="spellEnd"/>
+      <w:r>
+        <w:t xml:space="preserve"> de </w:t>
+      </w:r>
+      <w:proofErr w:type="spellStart"/>
+      <w:r>
+        <w:t>medición</w:t>
+      </w:r>
+      <w:proofErr w:type="spellEnd"/>
+      <w:r>
+        <w:t>.</w:t>
+      </w:r>
+    </w:p>
+    <w:p>
+      <w:pPr>
+        <w:rPr>
+          <w:lang w:val="es-ES"/>
+        </w:rPr>
+      </w:pPr>
+      <w:r>
+        <w:rPr>
+          <w:b/>
+          <w:bCs/>
+          <w:lang w:val="es-ES"/>
+        </w:rPr>
+        <w:t>Desventajas</w:t>
+      </w:r>
+      <w:r>
+        <w:rPr>
+          <w:lang w:val="es-ES"/>
+        </w:rPr>
+        <w:br/>
+        <w:t>– Partes móviles (motor/giro).</w:t>
+      </w:r>
+      <w:r>
+        <w:rPr>
+          <w:lang w:val="es-ES"/>
+        </w:rPr>
+        <w:br/>
+        <w:t>– Alto consumo de energía.</w:t>
+      </w:r>
+      <w:r>
+        <w:rPr>
+          <w:lang w:val="es-ES"/>
+        </w:rPr>
+        <w:br/>
+        <w:t>– Sensible a la reflectividad de superficies y a la luz solar intensa.</w:t>
+      </w:r>
+      <w:r>
+        <w:rPr>
+          <w:lang w:val="es-ES"/>
+        </w:rPr>
+        <w:br/>
+        <w:t>– Tiempo de escaneo finito: no ideal para plataformas muy rápidas.</w:t>
+      </w:r>
+    </w:p>
+    <w:p>
+      <w:pPr>
+        <w:rPr>
+          <w:lang w:val="es-ES"/>
+        </w:rPr>
+      </w:pPr>
+    </w:p>
+    <w:p>
+      <w:pPr>
+        <w:rPr>
+          <w:lang w:val="es-ES"/>
+        </w:rPr>
+      </w:pPr>
+    </w:p>
+    <w:p>
+      <w:pPr>
+        <w:rPr>
+          <w:lang w:val="es-ES"/>
+        </w:rPr>
+      </w:pPr>
+      <w:r>
+        <w:rPr>
+          <w:lang w:val="es-ES"/>
+        </w:rPr>
+        <w:t xml:space="preserve">6.8.1 </w:t>
+      </w:r>
+      <w:proofErr w:type="spellStart"/>
+      <w:r>
+        <w:rPr>
+          <w:lang w:val="es-ES"/>
+        </w:rPr>
+        <w:t>Lidar-based</w:t>
+      </w:r>
+      <w:proofErr w:type="spellEnd"/>
+      <w:r>
+        <w:rPr>
+          <w:lang w:val="es-ES"/>
+        </w:rPr>
+        <w:t xml:space="preserve"> </w:t>
+      </w:r>
+      <w:proofErr w:type="spellStart"/>
+      <w:r>
+        <w:rPr>
+          <w:lang w:val="es-ES"/>
+        </w:rPr>
+        <w:t>odometry</w:t>
+      </w:r>
+      <w:proofErr w:type="spellEnd"/>
+    </w:p>
+    <w:p>
+      <w:pPr>
+        <w:rPr>
+          <w:lang w:val="es-ES"/>
+        </w:rPr>
+      </w:pPr>
+      <w:r>
+        <w:rPr>
+          <w:lang w:val="es-ES"/>
+        </w:rPr>
+        <w:lastRenderedPageBreak/>
+        <w:drawing>
+          <wp:inline distT="0" distB="0" distL="0" distR="0" wp14:anchorId="7D560756" wp14:editId="3D76CB16">
+            <wp:extent cx="5731510" cy="7240270"/>
+            <wp:effectExtent l="0" t="0" r="2540" b="0"/>
+            <wp:docPr id="312383768" name="Imagen 1" descr="Captura de pantalla de un celular&#10;&#10;El contenido generado por IA puede ser incorrecto."/>
+            <wp:cNvGraphicFramePr>
+              <a:graphicFrameLocks xmlns:a="http://schemas.openxmlformats.org/drawingml/2006/main" noChangeAspect="1"/>
+            </wp:cNvGraphicFramePr>
+            <a:graphic xmlns:a="http://schemas.openxmlformats.org/drawingml/2006/main">
+              <a:graphicData uri="http://schemas.openxmlformats.org/drawingml/2006/picture">
+                <pic:pic xmlns:pic="http://schemas.openxmlformats.org/drawingml/2006/picture">
+                  <pic:nvPicPr>
+                    <pic:cNvPr id="312383768" name="Imagen 1" descr="Captura de pantalla de un celular&#10;&#10;El contenido generado por IA puede ser incorrecto."/>
+                    <pic:cNvPicPr/>
+                  </pic:nvPicPr>
+                  <pic:blipFill>
+                    <a:blip r:embed="rId14"/>
+                    <a:stretch>
+                      <a:fillRect/>
+                    </a:stretch>
+                  </pic:blipFill>
+                  <pic:spPr>
+                    <a:xfrm>
+                      <a:off x="0" y="0"/>
+                      <a:ext cx="5731510" cy="7240270"/>
+                    </a:xfrm>
+                    <a:prstGeom prst="rect">
+                      <a:avLst/>
+                    </a:prstGeom>
+                  </pic:spPr>
+                </pic:pic>
+              </a:graphicData>
+            </a:graphic>
+          </wp:inline>
+        </w:drawing>
+      </w:r>
+    </w:p>
+    <w:p>
+      <w:pPr>
+        <w:rPr>
+          <w:lang w:val="es-ES"/>
+        </w:rPr>
+      </w:pPr>
+      <w:r>
+        <w:rPr>
+          <w:b/>
+          <w:bCs/>
+          <w:lang w:val="es-ES"/>
+        </w:rPr>
+        <w:t>Objetivo</w:t>
+      </w:r>
+      <w:r>
+        <w:rPr>
+          <w:b/>
+          <w:bCs/>
+          <w:lang w:val="es-ES"/>
+        </w:rPr>
+        <w:br/>
+      </w:r>
+      <w:r>
+        <w:rPr>
+          <w:lang w:val="es-ES"/>
+        </w:rPr>
+        <w:t xml:space="preserve">Estimar el cambio de pose del robot usando datos de escaneo </w:t>
+      </w:r>
+      <w:proofErr w:type="spellStart"/>
+      <w:r>
+        <w:rPr>
+          <w:lang w:val="es-ES"/>
+        </w:rPr>
+        <w:t>Lidar</w:t>
+      </w:r>
+      <w:proofErr w:type="spellEnd"/>
+      <w:r>
+        <w:rPr>
+          <w:lang w:val="es-ES"/>
+        </w:rPr>
+        <w:t xml:space="preserve"> en lugar de la </w:t>
+      </w:r>
+      <w:proofErr w:type="spellStart"/>
+      <w:r>
+        <w:rPr>
+          <w:lang w:val="es-ES"/>
+        </w:rPr>
+        <w:t>odometría</w:t>
+      </w:r>
+      <w:proofErr w:type="spellEnd"/>
+      <w:r>
+        <w:rPr>
+          <w:lang w:val="es-ES"/>
+        </w:rPr>
+        <w:t xml:space="preserve"> de ruedas.</w:t>
+      </w:r>
+    </w:p>
     <w:p/>
     <w:p>
-      <w:r>
-        <w:t>6.5 Pose-Graph SLA</w:t>
-      </w:r>
-      <w:r>
-        <w:t>M</w:t>
+      <w:pPr>
+        <w:rPr>
+          <w:b/>
+          <w:bCs/>
+          <w:lang w:val="es-ES"/>
+        </w:rPr>
+      </w:pPr>
+      <w:r>
+        <w:rPr>
+          <w:b/>
+          <w:bCs/>
+          <w:lang w:val="es-ES"/>
+        </w:rPr>
+        <w:t>Carga del grafo de poses</w:t>
+      </w:r>
+    </w:p>
+    <w:p>
+      <w:pPr>
+        <w:rPr>
+          <w:b/>
+          <w:bCs/>
+          <w:lang w:val="es-ES"/>
+        </w:rPr>
+      </w:pPr>
+    </w:p>
+    <w:p>
+      <w:pPr>
+        <w:rPr>
+          <w:b/>
+          <w:bCs/>
+          <w:lang w:val="es-ES"/>
+        </w:rPr>
+      </w:pPr>
+      <w:r>
+        <w:rPr>
+          <w:b/>
+          <w:bCs/>
+          <w:lang w:val="es-ES"/>
+        </w:rPr>
+        <w:t>Acceso a rangos y ángulos</w:t>
+      </w:r>
+    </w:p>
+    <w:p>
+      <w:pPr>
+        <w:rPr>
+          <w:b/>
+          <w:bCs/>
+          <w:lang w:val="es-ES"/>
+        </w:rPr>
+      </w:pPr>
+      <w:r>
+        <w:rPr>
+          <w:b/>
+          <w:bCs/>
+          <w:lang w:val="es-ES"/>
+        </w:rPr>
+        <w:t>Visualización en coordenadas polares</w:t>
+      </w:r>
+    </w:p>
+    <w:p>
+      <w:pPr>
+        <w:rPr>
+          <w:b/>
+          <w:bCs/>
+          <w:lang w:val="es-ES"/>
+        </w:rPr>
+      </w:pPr>
+      <w:r>
+        <w:rPr>
+          <w:b/>
+          <w:bCs/>
+          <w:lang w:val="es-ES"/>
+        </w:rPr>
+        <w:t>Escaneo en coordenadas cartesianas</w:t>
+      </w:r>
+    </w:p>
+    <w:p>
+      <w:pPr>
+        <w:rPr>
+          <w:b/>
+          <w:bCs/>
+          <w:lang w:val="es-ES"/>
+        </w:rPr>
+      </w:pPr>
+      <w:r>
+        <w:rPr>
+          <w:b/>
+          <w:bCs/>
+          <w:lang w:val="es-ES"/>
+        </w:rPr>
+        <w:t>Alineación con ICP (</w:t>
+      </w:r>
+      <w:proofErr w:type="spellStart"/>
+      <w:r>
+        <w:rPr>
+          <w:b/>
+          <w:bCs/>
+          <w:lang w:val="es-ES"/>
+        </w:rPr>
+        <w:t>Iterated</w:t>
+      </w:r>
+      <w:proofErr w:type="spellEnd"/>
+      <w:r>
+        <w:rPr>
+          <w:b/>
+          <w:bCs/>
+          <w:lang w:val="es-ES"/>
+        </w:rPr>
+        <w:t xml:space="preserve"> </w:t>
+      </w:r>
+      <w:proofErr w:type="spellStart"/>
+      <w:r>
+        <w:rPr>
+          <w:b/>
+          <w:bCs/>
+          <w:lang w:val="es-ES"/>
+        </w:rPr>
+        <w:t>Closest</w:t>
+      </w:r>
+      <w:proofErr w:type="spellEnd"/>
+      <w:r>
+        <w:rPr>
+          <w:b/>
+          <w:bCs/>
+          <w:lang w:val="es-ES"/>
+        </w:rPr>
+        <w:t xml:space="preserve"> Point)</w:t>
+      </w:r>
+    </w:p>
+    <w:p>
+      <w:pPr>
+        <w:rPr>
+          <w:b/>
+          <w:bCs/>
+          <w:lang w:val="es-ES"/>
+        </w:rPr>
+      </w:pPr>
+      <w:r>
+        <w:rPr>
+          <w:b/>
+          <w:bCs/>
+          <w:lang w:val="es-ES"/>
+        </w:rPr>
+        <w:t>Velocidad implícita</w:t>
+      </w:r>
+    </w:p>
+    <w:p>
+      <w:pPr>
+        <w:rPr>
+          <w:lang w:val="es-ES"/>
+        </w:rPr>
+      </w:pPr>
+    </w:p>
+    <w:p>
+      <w:pPr>
+        <w:rPr>
+          <w:lang w:val="es-ES"/>
+        </w:rPr>
+      </w:pPr>
+      <w:r>
+        <w:rPr>
+          <w:lang w:val="es-ES"/>
+        </w:rPr>
+        <w:t>Algoritmo ICP</w:t>
+      </w:r>
+      <w:r>
+        <w:rPr>
+          <w:lang w:val="es-ES"/>
+        </w:rPr>
+        <w:br/>
+        <w:t>• Basado en “</w:t>
+      </w:r>
+      <w:proofErr w:type="spellStart"/>
+      <w:r>
+        <w:rPr>
+          <w:lang w:val="es-ES"/>
+        </w:rPr>
+        <w:t>Iterated</w:t>
+      </w:r>
+      <w:proofErr w:type="spellEnd"/>
+      <w:r>
+        <w:rPr>
+          <w:lang w:val="es-ES"/>
+        </w:rPr>
+        <w:t xml:space="preserve"> </w:t>
+      </w:r>
+      <w:proofErr w:type="spellStart"/>
+      <w:r>
+        <w:rPr>
+          <w:lang w:val="es-ES"/>
+        </w:rPr>
+        <w:t>Closest</w:t>
+      </w:r>
+      <w:proofErr w:type="spellEnd"/>
+      <w:r>
+        <w:rPr>
+          <w:lang w:val="es-ES"/>
+        </w:rPr>
+        <w:t xml:space="preserve"> Point”: en cada iteración asigna a cada punto del escaneo actual el vecino más cercano del anterior y calcula la transformación que minimiza la suma de distancias cuadráticas.</w:t>
+      </w:r>
+      <w:r>
+        <w:rPr>
+          <w:lang w:val="es-ES"/>
+        </w:rPr>
+        <w:br/>
+      </w:r>
+      <w:proofErr w:type="gramStart"/>
+      <w:r>
+        <w:rPr>
+          <w:lang w:val="es-ES"/>
+        </w:rPr>
+        <w:t>•  detalles</w:t>
+      </w:r>
+      <w:proofErr w:type="gramEnd"/>
+      <w:r>
+        <w:rPr>
+          <w:lang w:val="es-ES"/>
+        </w:rPr>
+        <w:t xml:space="preserve"> en la Sección 14.7.2 </w:t>
+      </w:r>
+    </w:p>
+    <w:p>
+      <w:pPr>
+        <w:rPr>
+          <w:lang w:val="es-ES"/>
+        </w:rPr>
+      </w:pPr>
+      <w:r>
+        <w:t xml:space="preserve">Es probable que: </w:t>
+      </w:r>
+    </w:p>
+    <w:p>
+      <w:pPr>
+        <w:numPr>
+          <w:ilvl w:val="0"/>
+          <w:numId w:val="14"/>
+        </w:numPr>
+        <w:rPr>
+          <w:lang w:val="es-ES"/>
+        </w:rPr>
+      </w:pPr>
+      <w:r>
+        <w:rPr>
+          <w:lang w:val="es-ES"/>
+        </w:rPr>
+        <w:t>Pulsos sin retorno (superficies poco reflectivas o espejadas) → rango máximo “falso”.</w:t>
+      </w:r>
+    </w:p>
+    <w:p>
+      <w:pPr>
+        <w:numPr>
+          <w:ilvl w:val="0"/>
+          <w:numId w:val="14"/>
+        </w:numPr>
+        <w:rPr>
+          <w:lang w:val="es-ES"/>
+        </w:rPr>
+      </w:pPr>
+      <w:r>
+        <w:rPr>
+          <w:lang w:val="es-ES"/>
+        </w:rPr>
+        <w:t>Objetos en movimiento (personas) provocan distancias variables.</w:t>
+      </w:r>
+    </w:p>
+    <w:p>
+      <w:pPr>
+        <w:numPr>
+          <w:ilvl w:val="0"/>
+          <w:numId w:val="14"/>
+        </w:numPr>
+        <w:rPr>
+          <w:lang w:val="es-ES"/>
+        </w:rPr>
+      </w:pPr>
+      <w:r>
+        <w:rPr>
+          <w:lang w:val="es-ES"/>
+        </w:rPr>
+        <w:t>Espacios amplios: muros fuera de rango.</w:t>
+      </w:r>
+    </w:p>
+    <w:p>
+      <w:pPr>
+        <w:numPr>
+          <w:ilvl w:val="0"/>
+          <w:numId w:val="14"/>
+        </w:numPr>
+        <w:rPr>
+          <w:lang w:val="es-ES"/>
+        </w:rPr>
+      </w:pPr>
+      <w:r>
+        <w:rPr>
+          <w:lang w:val="es-ES"/>
+        </w:rPr>
+        <w:t>Exteriores: gotas de lluvia, niebla o luz solar intensa alteran el eco.</w:t>
+      </w:r>
+    </w:p>
+    <w:p>
+      <w:pPr>
+        <w:numPr>
+          <w:ilvl w:val="0"/>
+          <w:numId w:val="14"/>
+        </w:numPr>
+        <w:rPr>
+          <w:lang w:val="es-ES"/>
+        </w:rPr>
+      </w:pPr>
+      <w:r>
+        <w:rPr>
+          <w:lang w:val="es-ES"/>
+        </w:rPr>
+        <w:t xml:space="preserve">Pasillos largos: dos líneas paralelas en escaneos sucesivos, ambigüedad de traslación → a menudo se recurre a </w:t>
+      </w:r>
+      <w:proofErr w:type="spellStart"/>
+      <w:r>
+        <w:rPr>
+          <w:lang w:val="es-ES"/>
+        </w:rPr>
+        <w:t>odometría</w:t>
+      </w:r>
+      <w:proofErr w:type="spellEnd"/>
+      <w:r>
+        <w:rPr>
+          <w:lang w:val="es-ES"/>
+        </w:rPr>
+        <w:t xml:space="preserve"> de ruedas.</w:t>
+      </w:r>
+    </w:p>
+    <w:p>
+      <w:pPr>
+        <w:numPr>
+          <w:ilvl w:val="0"/>
+          <w:numId w:val="14"/>
+        </w:numPr>
+      </w:pPr>
+      <w:proofErr w:type="spellStart"/>
+      <w:r>
+        <w:t>Ruido</w:t>
+      </w:r>
+      <w:proofErr w:type="spellEnd"/>
+      <w:r>
+        <w:t xml:space="preserve"> de </w:t>
+      </w:r>
+      <w:proofErr w:type="spellStart"/>
+      <w:r>
+        <w:t>medición</w:t>
+      </w:r>
+      <w:proofErr w:type="spellEnd"/>
+      <w:r>
+        <w:t xml:space="preserve"> </w:t>
+      </w:r>
+      <w:proofErr w:type="spellStart"/>
+      <w:r>
+        <w:t>inherente</w:t>
+      </w:r>
+      <w:proofErr w:type="spellEnd"/>
+      <w:r>
+        <w:t xml:space="preserve"> al sensor </w:t>
+      </w:r>
+    </w:p>
+    <w:p>
+      <w:pPr>
+        <w:rPr>
+          <w:lang w:val="es-ES"/>
+        </w:rPr>
+      </w:pPr>
+    </w:p>
+    <w:p>
+      <w:pPr>
+        <w:rPr>
+          <w:lang w:val="es-ES"/>
+        </w:rPr>
+      </w:pPr>
+    </w:p>
+    <w:p>
+      <w:r>
+        <w:t>6.8.</w:t>
+      </w:r>
+      <w:r>
+        <w:t xml:space="preserve">2 </w:t>
+      </w:r>
+      <w:r>
+        <w:t xml:space="preserve">Lidar-based </w:t>
+      </w:r>
+      <w:r>
+        <w:t>map buil</w:t>
+      </w:r>
+      <w:r>
+        <w:t>ding</w:t>
+      </w:r>
+    </w:p>
+    <w:p>
+      <w:r>
+        <w:drawing>
+          <wp:inline distT="0" distB="0" distL="0" distR="0" wp14:anchorId="7DC0A490" wp14:editId="47AB6A22">
+            <wp:extent cx="5731510" cy="1768475"/>
+            <wp:effectExtent l="0" t="0" r="2540" b="3175"/>
+            <wp:docPr id="988020287" name="Imagen 1" descr="Interfaz de usuario gráfica, Texto&#10;&#10;El contenido generado por IA puede ser incorrecto."/>
+            <wp:cNvGraphicFramePr>
+              <a:graphicFrameLocks xmlns:a="http://schemas.openxmlformats.org/drawingml/2006/main" noChangeAspect="1"/>
+            </wp:cNvGraphicFramePr>
+            <a:graphic xmlns:a="http://schemas.openxmlformats.org/drawingml/2006/main">
+              <a:graphicData uri="http://schemas.openxmlformats.org/drawingml/2006/picture">
+                <pic:pic xmlns:pic="http://schemas.openxmlformats.org/drawingml/2006/picture">
+                  <pic:nvPicPr>
+                    <pic:cNvPr id="988020287" name="Imagen 1" descr="Interfaz de usuario gráfica, Texto&#10;&#10;El contenido generado por IA puede ser incorrecto."/>
+                    <pic:cNvPicPr/>
+                  </pic:nvPicPr>
+                  <pic:blipFill>
+                    <a:blip r:embed="rId15"/>
+                    <a:stretch>
+                      <a:fillRect/>
+                    </a:stretch>
+                  </pic:blipFill>
+                  <pic:spPr>
+                    <a:xfrm>
+                      <a:off x="0" y="0"/>
+                      <a:ext cx="5731510" cy="1768475"/>
+                    </a:xfrm>
+                    <a:prstGeom prst="rect">
+                      <a:avLst/>
+                    </a:prstGeom>
+                  </pic:spPr>
+                </pic:pic>
+              </a:graphicData>
+            </a:graphic>
+          </wp:inline>
+        </w:drawing>
+      </w:r>
+    </w:p>
+    <w:p>
+      <w:pPr>
+        <w:rPr>
+          <w:lang w:val="es-ES"/>
+        </w:rPr>
+      </w:pPr>
+      <w:r>
+        <w:rPr>
+          <w:b/>
+          <w:bCs/>
+          <w:lang w:val="es-ES"/>
+        </w:rPr>
+        <w:lastRenderedPageBreak/>
+        <w:t>Condición inicial</w:t>
+      </w:r>
+      <w:r>
+        <w:rPr>
+          <w:lang w:val="es-ES"/>
+        </w:rPr>
+        <w:br/>
+        <w:t xml:space="preserve">Asumiendo que la pose del robot está suficientemente bien conocida (por </w:t>
+      </w:r>
+      <w:proofErr w:type="gramStart"/>
+      <w:r>
+        <w:rPr>
+          <w:lang w:val="es-ES"/>
+        </w:rPr>
+        <w:t>ejemplo</w:t>
+      </w:r>
+      <w:proofErr w:type="gramEnd"/>
+      <w:r>
+        <w:rPr>
+          <w:lang w:val="es-ES"/>
+        </w:rPr>
+        <w:t xml:space="preserve"> tras un paso de localización), se transforman todos los escaneos </w:t>
+      </w:r>
+      <w:proofErr w:type="spellStart"/>
+      <w:r>
+        <w:rPr>
+          <w:lang w:val="es-ES"/>
+        </w:rPr>
+        <w:t>Lidar</w:t>
+      </w:r>
+      <w:proofErr w:type="spellEnd"/>
+      <w:r>
+        <w:rPr>
+          <w:lang w:val="es-ES"/>
+        </w:rPr>
+        <w:t xml:space="preserve"> al marco de coordenadas global y se construye un mapa de ocupación </w:t>
+      </w:r>
+    </w:p>
+    <w:p>
+      <w:proofErr w:type="spellStart"/>
+      <w:r>
+        <w:rPr>
+          <w:b/>
+          <w:bCs/>
+        </w:rPr>
+        <w:t>Interpretación</w:t>
+      </w:r>
+      <w:proofErr w:type="spellEnd"/>
+      <w:r>
+        <w:rPr>
+          <w:b/>
+          <w:bCs/>
+        </w:rPr>
+        <w:t xml:space="preserve"> de </w:t>
+      </w:r>
+      <w:proofErr w:type="spellStart"/>
+      <w:r>
+        <w:rPr>
+          <w:b/>
+          <w:bCs/>
+        </w:rPr>
+        <w:t>cada</w:t>
+      </w:r>
+      <w:proofErr w:type="spellEnd"/>
+      <w:r>
+        <w:rPr>
+          <w:b/>
+          <w:bCs/>
+        </w:rPr>
+        <w:t xml:space="preserve"> </w:t>
+      </w:r>
+      <w:proofErr w:type="spellStart"/>
+      <w:r>
+        <w:rPr>
+          <w:b/>
+          <w:bCs/>
+        </w:rPr>
+        <w:t>haz</w:t>
+      </w:r>
+      <w:proofErr w:type="spellEnd"/>
+    </w:p>
+    <w:p>
+      <w:pPr>
+        <w:numPr>
+          <w:ilvl w:val="0"/>
+          <w:numId w:val="15"/>
+        </w:numPr>
+        <w:rPr>
+          <w:lang w:val="es-ES"/>
+        </w:rPr>
+      </w:pPr>
+      <w:r>
+        <w:rPr>
+          <w:lang w:val="es-ES"/>
+        </w:rPr>
+        <w:t>El haz emite un rayo desde la pose conocida; la medida de distancia indica la celda que contiene el primer obstáculo.</w:t>
+      </w:r>
+    </w:p>
+    <w:p>
+      <w:pPr>
+        <w:numPr>
+          <w:ilvl w:val="0"/>
+          <w:numId w:val="15"/>
+        </w:numPr>
+        <w:rPr>
+          <w:lang w:val="es-ES"/>
+        </w:rPr>
+      </w:pPr>
+      <w:r>
+        <w:rPr>
+          <w:lang w:val="es-ES"/>
+        </w:rPr>
+        <w:t>Implícitamente, todas las celdas entre el sensor y ese obstáculo están libres.</w:t>
+      </w:r>
+    </w:p>
+    <w:p>
+      <w:pPr>
+        <w:numPr>
+          <w:ilvl w:val="0"/>
+          <w:numId w:val="15"/>
+        </w:numPr>
+        <w:rPr>
+          <w:lang w:val="es-ES"/>
+        </w:rPr>
+      </w:pPr>
+      <w:r>
+        <w:rPr>
+          <w:lang w:val="es-ES"/>
+        </w:rPr>
+        <w:t xml:space="preserve">Si no hay retorno (superficie no reflectiva o más allá del rango máximo), se ignora el rayo completo </w:t>
+      </w:r>
+    </w:p>
+    <w:p>
+      <w:pPr>
+        <w:rPr>
+          <w:lang w:val="es-ES"/>
+        </w:rPr>
+      </w:pPr>
+      <w:r>
+        <w:rPr>
+          <w:lang w:val="es-ES"/>
+        </w:rPr>
+        <w:t xml:space="preserve"> </w:t>
+      </w:r>
+      <w:r>
+        <w:rPr>
+          <w:b/>
+          <w:bCs/>
+          <w:lang w:val="es-ES"/>
+        </w:rPr>
+        <w:t>Esquema de votos</w:t>
+      </w:r>
+      <w:r>
+        <w:rPr>
+          <w:lang w:val="es-ES"/>
+        </w:rPr>
+        <w:br/>
+        <w:t>Cada vez que un rayo atraviesa una celda:</w:t>
+      </w:r>
+    </w:p>
+    <w:p>
+      <w:pPr>
+        <w:numPr>
+          <w:ilvl w:val="0"/>
+          <w:numId w:val="16"/>
+        </w:numPr>
+        <w:rPr>
+          <w:lang w:val="es-ES"/>
+        </w:rPr>
+      </w:pPr>
+      <w:r>
+        <w:rPr>
+          <w:b/>
+          <w:bCs/>
+          <w:lang w:val="es-ES"/>
+        </w:rPr>
+        <w:t>Libre</w:t>
+      </w:r>
+      <w:r>
+        <w:rPr>
+          <w:lang w:val="es-ES"/>
+        </w:rPr>
+        <w:t>: decrementar el “voto” de ocupación.</w:t>
+      </w:r>
+    </w:p>
+    <w:p>
+      <w:pPr>
+        <w:numPr>
+          <w:ilvl w:val="0"/>
+          <w:numId w:val="16"/>
+        </w:numPr>
+        <w:rPr>
+          <w:lang w:val="es-ES"/>
+        </w:rPr>
+      </w:pPr>
+      <w:r>
+        <w:rPr>
+          <w:b/>
+          <w:bCs/>
+          <w:lang w:val="es-ES"/>
+        </w:rPr>
+        <w:t>Ocupada</w:t>
+      </w:r>
+      <w:r>
+        <w:rPr>
+          <w:lang w:val="es-ES"/>
+        </w:rPr>
+        <w:t xml:space="preserve"> (primera celda con retorno): incrementar el voto y detener el trazado del rayo.</w:t>
+      </w:r>
+    </w:p>
+    <w:p>
+      <w:pPr>
+        <w:numPr>
+          <w:ilvl w:val="0"/>
+          <w:numId w:val="16"/>
+        </w:numPr>
+        <w:rPr>
+          <w:lang w:val="es-ES"/>
+        </w:rPr>
+      </w:pPr>
+      <w:r>
+        <w:rPr>
+          <w:lang w:val="es-ES"/>
+        </w:rPr>
+        <w:t xml:space="preserve">Se recorre el rayo celda a celda usando el algoritmo de </w:t>
+      </w:r>
+      <w:proofErr w:type="spellStart"/>
+      <w:r>
+        <w:rPr>
+          <w:lang w:val="es-ES"/>
+        </w:rPr>
+        <w:t>Bresenham</w:t>
+      </w:r>
+      <w:proofErr w:type="spellEnd"/>
+      <w:r>
+        <w:rPr>
+          <w:lang w:val="es-ES"/>
+        </w:rPr>
+        <w:t xml:space="preserve"> para líneas discretas </w:t>
+      </w:r>
+    </w:p>
+    <w:p>
+      <w:pPr>
+        <w:rPr>
+          <w:lang w:val="es-ES"/>
+        </w:rPr>
+      </w:pPr>
+    </w:p>
+    <w:p>
+      <w:r>
+        <w:t>6.8.</w:t>
+      </w:r>
+      <w:r>
+        <w:t>3</w:t>
+      </w:r>
+      <w:r>
+        <w:t xml:space="preserve"> Lidar-based </w:t>
+      </w:r>
+      <w:r>
+        <w:t xml:space="preserve">localization </w:t>
       </w:r>
     </w:p>
     <w:p/>
     <w:p>
       <w:r>
-        <w:t xml:space="preserve">6.6 </w:t>
+        <w:drawing>
+          <wp:inline distT="0" distB="0" distL="0" distR="0" wp14:anchorId="33A9CB40" wp14:editId="0860A1C2">
+            <wp:extent cx="5731510" cy="2621280"/>
+            <wp:effectExtent l="0" t="0" r="2540" b="7620"/>
+            <wp:docPr id="1368304673" name="Imagen 1" descr="Gráfico&#10;&#10;El contenido generado por IA puede ser incorrecto."/>
+            <wp:cNvGraphicFramePr>
+              <a:graphicFrameLocks xmlns:a="http://schemas.openxmlformats.org/drawingml/2006/main" noChangeAspect="1"/>
+            </wp:cNvGraphicFramePr>
+            <a:graphic xmlns:a="http://schemas.openxmlformats.org/drawingml/2006/main">
+              <a:graphicData uri="http://schemas.openxmlformats.org/drawingml/2006/picture">
+                <pic:pic xmlns:pic="http://schemas.openxmlformats.org/drawingml/2006/picture">
+                  <pic:nvPicPr>
+                    <pic:cNvPr id="1368304673" name="Imagen 1" descr="Gráfico&#10;&#10;El contenido generado por IA puede ser incorrecto."/>
+                    <pic:cNvPicPr/>
+                  </pic:nvPicPr>
+                  <pic:blipFill>
+                    <a:blip r:embed="rId16"/>
+                    <a:stretch>
+                      <a:fillRect/>
+                    </a:stretch>
+                  </pic:blipFill>
+                  <pic:spPr>
+                    <a:xfrm>
+                      <a:off x="0" y="0"/>
+                      <a:ext cx="5731510" cy="2621280"/>
+                    </a:xfrm>
+                    <a:prstGeom prst="rect">
+                      <a:avLst/>
+                    </a:prstGeom>
+                  </pic:spPr>
+                </pic:pic>
+              </a:graphicData>
+            </a:graphic>
+          </wp:inline>
+        </w:drawing>
+      </w:r>
+    </w:p>
+    <w:p>
+      <w:pPr>
+        <w:numPr>
+          <w:ilvl w:val="0"/>
+          <w:numId w:val="17"/>
+        </w:numPr>
+        <w:rPr>
+          <w:lang w:val="es-ES"/>
+        </w:rPr>
+      </w:pPr>
+      <w:r>
+        <w:rPr>
+          <w:b/>
+          <w:bCs/>
+          <w:lang w:val="es-ES"/>
+        </w:rPr>
+        <w:t xml:space="preserve">Qué son los </w:t>
       </w:r>
       <w:proofErr w:type="spellStart"/>
       <w:r>
-        <w:t>SequentialMonte</w:t>
+        <w:rPr>
+          <w:b/>
+          <w:bCs/>
+          <w:lang w:val="es-ES"/>
+        </w:rPr>
+        <w:t>landmarks</w:t>
       </w:r>
       <w:proofErr w:type="spellEnd"/>
       <w:r>
-        <w:t xml:space="preserve">-Carlo Localization </w:t>
-      </w:r>
-    </w:p>
-    <w:p/>
-    <w:p>
-      <w:r>
-        <w:t>6.7 Rao-</w:t>
+        <w:rPr>
+          <w:b/>
+          <w:bCs/>
+          <w:lang w:val="es-ES"/>
+        </w:rPr>
+        <w:t xml:space="preserve"> en </w:t>
       </w:r>
       <w:proofErr w:type="spellStart"/>
       <w:r>
-        <w:t>Blackwellized</w:t>
+        <w:rPr>
+          <w:b/>
+          <w:bCs/>
+          <w:lang w:val="es-ES"/>
+        </w:rPr>
+        <w:t>Lidar</w:t>
       </w:r>
       <w:proofErr w:type="spellEnd"/>
       <w:r>
-        <w:t xml:space="preserve"> SLAM </w:t>
-      </w:r>
-    </w:p>
-    <w:p/>
-    <w:p>
-      <w:r>
-        <w:t xml:space="preserve">6.8 Application: Lidar </w:t>
-      </w:r>
-    </w:p>
-    <w:p/>
-    <w:p/>
-    <w:p/>
-    <w:p>
-      <w:r>
-        <w:t>6.9 Wrapping Up</w:t>
-      </w:r>
+        <w:rPr>
+          <w:lang w:val="es-ES"/>
+        </w:rPr>
+        <w:br/>
+        <w:t>Un “</w:t>
+      </w:r>
+      <w:proofErr w:type="spellStart"/>
+      <w:r>
+        <w:rPr>
+          <w:lang w:val="es-ES"/>
+        </w:rPr>
+        <w:t>landmark</w:t>
+      </w:r>
+      <w:proofErr w:type="spellEnd"/>
+      <w:r>
+        <w:rPr>
+          <w:lang w:val="es-ES"/>
+        </w:rPr>
+        <w:t xml:space="preserve">” puede ser cualquier firma geométrica distintiva extraída de un </w:t>
+      </w:r>
+      <w:r>
+        <w:rPr>
+          <w:lang w:val="es-ES"/>
+        </w:rPr>
+        <w:lastRenderedPageBreak/>
+        <w:t xml:space="preserve">escaneo </w:t>
+      </w:r>
+      <w:proofErr w:type="spellStart"/>
+      <w:r>
+        <w:rPr>
+          <w:lang w:val="es-ES"/>
+        </w:rPr>
+        <w:t>Lidar</w:t>
+      </w:r>
+      <w:proofErr w:type="spellEnd"/>
+      <w:r>
+        <w:rPr>
+          <w:lang w:val="es-ES"/>
+        </w:rPr>
+        <w:t xml:space="preserve"> — por ejemplo, un conjunto único de puntos que forman un ángulo, un saliente o un patrón reconocible (Springer </w:t>
+      </w:r>
+      <w:proofErr w:type="spellStart"/>
+      <w:r>
+        <w:rPr>
+          <w:lang w:val="es-ES"/>
+        </w:rPr>
+        <w:t>Tracts</w:t>
+      </w:r>
+      <w:proofErr w:type="spellEnd"/>
+      <w:r>
+        <w:rPr>
+          <w:lang w:val="es-ES"/>
+        </w:rPr>
+        <w:t xml:space="preserve"> in </w:t>
+      </w:r>
+      <w:proofErr w:type="spellStart"/>
+      <w:r>
+        <w:rPr>
+          <w:lang w:val="es-ES"/>
+        </w:rPr>
+        <w:t>Adv</w:t>
+      </w:r>
+      <w:proofErr w:type="spellEnd"/>
+      <w:r>
+        <w:rPr>
+          <w:lang w:val="es-ES"/>
+        </w:rPr>
+        <w:t>….</w:t>
+      </w:r>
+    </w:p>
+    <w:p>
+      <w:pPr>
+        <w:numPr>
+          <w:ilvl w:val="0"/>
+          <w:numId w:val="17"/>
+        </w:numPr>
+        <w:rPr>
+          <w:lang w:val="es-ES"/>
+        </w:rPr>
+      </w:pPr>
+      <w:r>
+        <w:rPr>
+          <w:b/>
+          <w:bCs/>
+          <w:lang w:val="es-ES"/>
+        </w:rPr>
+        <w:t>Uso de firmas geométricas</w:t>
+      </w:r>
+      <w:r>
+        <w:rPr>
+          <w:lang w:val="es-ES"/>
+        </w:rPr>
+        <w:br/>
+        <w:t>• A partir de un escaneo (Fig. 6.28a o 6.29b) se identifican subconjuntos de puntos con una disposición espacial característica (“</w:t>
+      </w:r>
+      <w:proofErr w:type="spellStart"/>
+      <w:r>
+        <w:rPr>
+          <w:lang w:val="es-ES"/>
+        </w:rPr>
+        <w:t>geometric</w:t>
+      </w:r>
+      <w:proofErr w:type="spellEnd"/>
+      <w:r>
+        <w:rPr>
+          <w:lang w:val="es-ES"/>
+        </w:rPr>
+        <w:t xml:space="preserve"> </w:t>
+      </w:r>
+      <w:proofErr w:type="spellStart"/>
+      <w:r>
+        <w:rPr>
+          <w:lang w:val="es-ES"/>
+        </w:rPr>
+        <w:t>signature</w:t>
+      </w:r>
+      <w:proofErr w:type="spellEnd"/>
+      <w:r>
+        <w:rPr>
+          <w:lang w:val="es-ES"/>
+        </w:rPr>
+        <w:t>”).</w:t>
+      </w:r>
+      <w:r>
+        <w:rPr>
+          <w:lang w:val="es-ES"/>
+        </w:rPr>
+        <w:br/>
+        <w:t>• Cada firma actúa como marca: su posición relativa al robot se convierte en una observación de rango y ángulo.</w:t>
+      </w:r>
+    </w:p>
+    <w:p>
+      <w:pPr>
+        <w:numPr>
+          <w:ilvl w:val="0"/>
+          <w:numId w:val="17"/>
+        </w:numPr>
+        <w:rPr>
+          <w:lang w:val="es-ES"/>
+        </w:rPr>
+      </w:pPr>
+      <w:r>
+        <w:rPr>
+          <w:b/>
+          <w:bCs/>
+          <w:lang w:val="es-ES"/>
+        </w:rPr>
+        <w:t>Estrategia ingenua de emparejamiento</w:t>
+      </w:r>
+      <w:r>
+        <w:rPr>
+          <w:lang w:val="es-ES"/>
+        </w:rPr>
+        <w:br/>
+        <w:t>• Comparar el escaneo actual contra todos los escaneos previos (o contra un mapa de firmas) usando ICP;</w:t>
+      </w:r>
+      <w:r>
+        <w:rPr>
+          <w:lang w:val="es-ES"/>
+        </w:rPr>
+        <w:br/>
+        <w:t>• Si el error de alineación es bajo, añadir una nueva arista de restricción al grafo de poses;</w:t>
+      </w:r>
+      <w:r>
+        <w:rPr>
+          <w:lang w:val="es-ES"/>
+        </w:rPr>
+        <w:br/>
+        <w:t xml:space="preserve">• Muy costoso con muchas poses: demanda O(N) emparejamientos por escaneo (Springer </w:t>
+      </w:r>
+      <w:proofErr w:type="spellStart"/>
+      <w:r>
+        <w:rPr>
+          <w:lang w:val="es-ES"/>
+        </w:rPr>
+        <w:t>Tracts</w:t>
+      </w:r>
+      <w:proofErr w:type="spellEnd"/>
+      <w:r>
+        <w:rPr>
+          <w:lang w:val="es-ES"/>
+        </w:rPr>
+        <w:t xml:space="preserve"> in </w:t>
+      </w:r>
+      <w:proofErr w:type="spellStart"/>
+      <w:r>
+        <w:rPr>
+          <w:lang w:val="es-ES"/>
+        </w:rPr>
+        <w:t>Adv</w:t>
+      </w:r>
+      <w:proofErr w:type="spellEnd"/>
+      <w:r>
+        <w:rPr>
+          <w:lang w:val="es-ES"/>
+        </w:rPr>
+        <w:t>….</w:t>
+      </w:r>
+    </w:p>
+    <w:p>
+      <w:pPr>
+        <w:numPr>
+          <w:ilvl w:val="0"/>
+          <w:numId w:val="17"/>
+        </w:numPr>
+        <w:rPr>
+          <w:lang w:val="es-ES"/>
+        </w:rPr>
+      </w:pPr>
+      <w:r>
+        <w:rPr>
+          <w:b/>
+          <w:bCs/>
+          <w:lang w:val="es-ES"/>
+        </w:rPr>
+        <w:t>Optimización práctica</w:t>
+      </w:r>
+      <w:r>
+        <w:rPr>
+          <w:lang w:val="es-ES"/>
+        </w:rPr>
+        <w:br/>
+        <w:t>Sólo se prueban emparejamientos con escaneos cuya pose estimada esté cerca de la actual, reduciendo cálculos y evitando falsos positivos.</w:t>
+      </w:r>
+    </w:p>
+    <w:p>
+      <w:pPr>
+        <w:numPr>
+          <w:ilvl w:val="0"/>
+          <w:numId w:val="17"/>
+        </w:numPr>
+        <w:rPr>
+          <w:lang w:val="es-ES"/>
+        </w:rPr>
+      </w:pPr>
+      <w:r>
+        <w:rPr>
+          <w:b/>
+          <w:bCs/>
+          <w:lang w:val="es-ES"/>
+        </w:rPr>
+        <w:t xml:space="preserve">Desafíos de data </w:t>
+      </w:r>
+      <w:proofErr w:type="spellStart"/>
+      <w:r>
+        <w:rPr>
+          <w:b/>
+          <w:bCs/>
+          <w:lang w:val="es-ES"/>
+        </w:rPr>
+        <w:t>association</w:t>
+      </w:r>
+      <w:proofErr w:type="spellEnd"/>
+      <w:r>
+        <w:rPr>
+          <w:lang w:val="es-ES"/>
+        </w:rPr>
+        <w:br/>
+        <w:t>– Ambigüedad en entornos repetitivos (pasillos, muros paralelos).</w:t>
+      </w:r>
+      <w:r>
+        <w:rPr>
+          <w:lang w:val="es-ES"/>
+        </w:rPr>
+        <w:br/>
+        <w:t xml:space="preserve">– Necesidad de confidencia alta (p. ej. test de </w:t>
+      </w:r>
+      <w:proofErr w:type="spellStart"/>
+      <w:r>
+        <w:rPr>
+          <w:lang w:val="es-ES"/>
+        </w:rPr>
+        <w:t>Mahalanobis</w:t>
+      </w:r>
+      <w:proofErr w:type="spellEnd"/>
+      <w:r>
+        <w:rPr>
+          <w:lang w:val="es-ES"/>
+        </w:rPr>
+        <w:t>) para no introducir errores catastróficos.</w:t>
+      </w:r>
+      <w:r>
+        <w:rPr>
+          <w:lang w:val="es-ES"/>
+        </w:rPr>
+        <w:br/>
+        <w:t xml:space="preserve">– A menudo se complementa con </w:t>
+      </w:r>
+      <w:proofErr w:type="spellStart"/>
+      <w:r>
+        <w:rPr>
+          <w:lang w:val="es-ES"/>
+        </w:rPr>
+        <w:t>odometría</w:t>
+      </w:r>
+      <w:proofErr w:type="spellEnd"/>
+      <w:r>
+        <w:rPr>
+          <w:lang w:val="es-ES"/>
+        </w:rPr>
+        <w:t xml:space="preserve"> de ruedas o sensores adicionales para robustecer la asociación.</w:t>
+      </w:r>
+    </w:p>
+    <w:p>
+      <w:pPr>
+        <w:rPr>
+          <w:lang w:val="es-ES"/>
+        </w:rPr>
+      </w:pPr>
+      <w:r>
+        <w:rPr>
+          <w:lang w:val="es-ES"/>
+        </w:rPr>
+        <w:t xml:space="preserve">Con ello, la localización basada en </w:t>
+      </w:r>
+      <w:proofErr w:type="spellStart"/>
+      <w:r>
+        <w:rPr>
+          <w:lang w:val="es-ES"/>
+        </w:rPr>
+        <w:t>Lidar</w:t>
+      </w:r>
+      <w:proofErr w:type="spellEnd"/>
+      <w:r>
+        <w:rPr>
+          <w:lang w:val="es-ES"/>
+        </w:rPr>
+        <w:t xml:space="preserve"> incorpora firmas geométricas como “</w:t>
+      </w:r>
+      <w:proofErr w:type="spellStart"/>
+      <w:r>
+        <w:rPr>
+          <w:lang w:val="es-ES"/>
+        </w:rPr>
+        <w:t>landmarks</w:t>
+      </w:r>
+      <w:proofErr w:type="spellEnd"/>
+      <w:r>
+        <w:rPr>
+          <w:lang w:val="es-ES"/>
+        </w:rPr>
+        <w:t>”, empareja escaneos vía ICP y gestiona la asociación de datos en el grafo de poses para refinar continuamente la estimación de la trayectoria.</w:t>
+      </w:r>
+    </w:p>
+    <w:p>
+      <w:pPr>
+        <w:rPr>
+          <w:lang w:val="es-ES"/>
+        </w:rPr>
+      </w:pPr>
+    </w:p>
+    <w:p>
+      <w:pPr>
+        <w:rPr>
+          <w:lang w:val="es-ES"/>
+        </w:rPr>
+      </w:pPr>
+    </w:p>
+    <w:p>
+      <w:pPr>
+        <w:rPr>
+          <w:lang w:val="es-ES"/>
+        </w:rPr>
+      </w:pPr>
     </w:p>
     <w:p/>
     <w:sectPr>
@@ -1326,6 +4194,530 @@
 <file path=word/numbering.xml><?xml version="1.0" encoding="utf-8"?>
 <w:numbering xmlns:wpc="http://schemas.microsoft.com/office/word/2010/wordprocessingCanvas" xmlns:cx="http://schemas.microsoft.com/office/drawing/2014/chartex" xmlns:cx1="http://schemas.microsoft.com/office/drawing/2015/9/8/chartex" xmlns:cx2="http://schemas.microsoft.com/office/drawing/2015/10/21/chartex" xmlns:cx3="http://schemas.microsoft.com/office/drawing/2016/5/9/chartex" xmlns:cx4="http://schemas.microsoft.com/office/drawing/2016/5/10/chartex" xmlns:cx5="http://schemas.microsoft.com/office/drawing/2016/5/11/chartex" xmlns:cx6="http://schemas.microsoft.com/office/drawing/2016/5/12/chartex" xmlns:cx7="http://schemas.microsoft.com/office/drawing/2016/5/13/chartex" xmlns:cx8="http://schemas.microsoft.com/office/drawing/2016/5/14/chartex" xmlns:mc="http://schemas.openxmlformats.org/markup-compatibility/2006" xmlns:aink="http://schemas.microsoft.com/office/drawing/2016/ink" xmlns:am3d="http://schemas.microsoft.com/office/drawing/2017/model3d" xmlns:o="urn:schemas-microsoft-com:office:office" xmlns:oel="http://schemas.microsoft.com/office/2019/extlst" xmlns:r="http://schemas.openxmlformats.org/officeDocument/2006/relationships" xmlns:m="http://schemas.openxmlformats.org/officeDocument/2006/math" xmlns:v="urn:schemas-microsoft-com:vml" xmlns:wp14="http://schemas.microsoft.com/office/word/2010/wordprocessingDrawing" xmlns:wp="http://schemas.openxmlformats.org/drawingml/2006/wordprocessingDrawing" xmlns:w10="urn:schemas-microsoft-com:office:word" xmlns:w="http://schemas.openxmlformats.org/wordprocessingml/2006/main" xmlns:w14="http://schemas.microsoft.com/office/word/2010/wordml" xmlns:w15="http://schemas.microsoft.com/office/word/2012/wordml" xmlns:w16cex="http://schemas.microsoft.com/office/word/2018/wordml/cex" xmlns:w16cid="http://schemas.microsoft.com/office/word/2016/wordml/cid" xmlns:w16="http://schemas.microsoft.com/office/word/2018/wordml" xmlns:w16du="http://schemas.microsoft.com/office/word/2023/wordml/word16du" xmlns:w16sdtdh="http://schemas.microsoft.com/office/word/2020/wordml/sdtdatahash" xmlns:w16sdtfl="http://schemas.microsoft.com/office/word/2024/wordml/sdtformatlock" xmlns:w16se="http://schemas.microsoft.com/office/word/2015/wordml/symex" xmlns:wpg="http://schemas.microsoft.com/office/word/2010/wordprocessingGroup" xmlns:wpi="http://schemas.microsoft.com/office/word/2010/wordprocessingInk" xmlns:wne="http://schemas.microsoft.com/office/word/2006/wordml" xmlns:wps="http://schemas.microsoft.com/office/word/2010/wordprocessingShape" mc:Ignorable="w14 w15 w16se w16cid w16 w16cex w16sdtdh w16sdtfl w16du wp14">
   <w:abstractNum w:abstractNumId="0" w15:restartNumberingAfterBreak="0">
+    <w:nsid w:val="120040D4"/>
+    <w:multiLevelType w:val="multilevel"/>
+    <w:tmpl w:val="7D6C28F8"/>
+    <w:lvl w:ilvl="0">
+      <w:start w:val="1"/>
+      <w:numFmt w:val="decimal"/>
+      <w:lvlText w:val="%1."/>
+      <w:lvlJc w:val="left"/>
+      <w:pPr>
+        <w:tabs>
+          <w:tab w:val="num" w:pos="720"/>
+        </w:tabs>
+        <w:ind w:left="720" w:hanging="360"/>
+      </w:pPr>
+    </w:lvl>
+    <w:lvl w:ilvl="1">
+      <w:start w:val="1"/>
+      <w:numFmt w:val="bullet"/>
+      <w:lvlText w:val="o"/>
+      <w:lvlJc w:val="left"/>
+      <w:pPr>
+        <w:tabs>
+          <w:tab w:val="num" w:pos="1440"/>
+        </w:tabs>
+        <w:ind w:left="1440" w:hanging="360"/>
+      </w:pPr>
+      <w:rPr>
+        <w:rFonts w:ascii="Courier New" w:hAnsi="Courier New" w:hint="default"/>
+        <w:sz w:val="20"/>
+      </w:rPr>
+    </w:lvl>
+    <w:lvl w:ilvl="2" w:tentative="1">
+      <w:start w:val="1"/>
+      <w:numFmt w:val="decimal"/>
+      <w:lvlText w:val="%3."/>
+      <w:lvlJc w:val="left"/>
+      <w:pPr>
+        <w:tabs>
+          <w:tab w:val="num" w:pos="2160"/>
+        </w:tabs>
+        <w:ind w:left="2160" w:hanging="360"/>
+      </w:pPr>
+    </w:lvl>
+    <w:lvl w:ilvl="3" w:tentative="1">
+      <w:start w:val="1"/>
+      <w:numFmt w:val="decimal"/>
+      <w:lvlText w:val="%4."/>
+      <w:lvlJc w:val="left"/>
+      <w:pPr>
+        <w:tabs>
+          <w:tab w:val="num" w:pos="2880"/>
+        </w:tabs>
+        <w:ind w:left="2880" w:hanging="360"/>
+      </w:pPr>
+    </w:lvl>
+    <w:lvl w:ilvl="4" w:tentative="1">
+      <w:start w:val="1"/>
+      <w:numFmt w:val="decimal"/>
+      <w:lvlText w:val="%5."/>
+      <w:lvlJc w:val="left"/>
+      <w:pPr>
+        <w:tabs>
+          <w:tab w:val="num" w:pos="3600"/>
+        </w:tabs>
+        <w:ind w:left="3600" w:hanging="360"/>
+      </w:pPr>
+    </w:lvl>
+    <w:lvl w:ilvl="5" w:tentative="1">
+      <w:start w:val="1"/>
+      <w:numFmt w:val="decimal"/>
+      <w:lvlText w:val="%6."/>
+      <w:lvlJc w:val="left"/>
+      <w:pPr>
+        <w:tabs>
+          <w:tab w:val="num" w:pos="4320"/>
+        </w:tabs>
+        <w:ind w:left="4320" w:hanging="360"/>
+      </w:pPr>
+    </w:lvl>
+    <w:lvl w:ilvl="6" w:tentative="1">
+      <w:start w:val="1"/>
+      <w:numFmt w:val="decimal"/>
+      <w:lvlText w:val="%7."/>
+      <w:lvlJc w:val="left"/>
+      <w:pPr>
+        <w:tabs>
+          <w:tab w:val="num" w:pos="5040"/>
+        </w:tabs>
+        <w:ind w:left="5040" w:hanging="360"/>
+      </w:pPr>
+    </w:lvl>
+    <w:lvl w:ilvl="7" w:tentative="1">
+      <w:start w:val="1"/>
+      <w:numFmt w:val="decimal"/>
+      <w:lvlText w:val="%8."/>
+      <w:lvlJc w:val="left"/>
+      <w:pPr>
+        <w:tabs>
+          <w:tab w:val="num" w:pos="5760"/>
+        </w:tabs>
+        <w:ind w:left="5760" w:hanging="360"/>
+      </w:pPr>
+    </w:lvl>
+    <w:lvl w:ilvl="8" w:tentative="1">
+      <w:start w:val="1"/>
+      <w:numFmt w:val="decimal"/>
+      <w:lvlText w:val="%9."/>
+      <w:lvlJc w:val="left"/>
+      <w:pPr>
+        <w:tabs>
+          <w:tab w:val="num" w:pos="6480"/>
+        </w:tabs>
+        <w:ind w:left="6480" w:hanging="360"/>
+      </w:pPr>
+    </w:lvl>
+  </w:abstractNum>
+  <w:abstractNum w:abstractNumId="1" w15:restartNumberingAfterBreak="0">
+    <w:nsid w:val="1CC316C7"/>
+    <w:multiLevelType w:val="multilevel"/>
+    <w:tmpl w:val="07940E0C"/>
+    <w:lvl w:ilvl="0">
+      <w:start w:val="1"/>
+      <w:numFmt w:val="bullet"/>
+      <w:lvlText w:val=""/>
+      <w:lvlJc w:val="left"/>
+      <w:pPr>
+        <w:tabs>
+          <w:tab w:val="num" w:pos="720"/>
+        </w:tabs>
+        <w:ind w:left="720" w:hanging="360"/>
+      </w:pPr>
+      <w:rPr>
+        <w:rFonts w:ascii="Symbol" w:hAnsi="Symbol" w:hint="default"/>
+        <w:sz w:val="20"/>
+      </w:rPr>
+    </w:lvl>
+    <w:lvl w:ilvl="1">
+      <w:start w:val="1"/>
+      <w:numFmt w:val="decimal"/>
+      <w:lvlText w:val="%2."/>
+      <w:lvlJc w:val="left"/>
+      <w:pPr>
+        <w:tabs>
+          <w:tab w:val="num" w:pos="1440"/>
+        </w:tabs>
+        <w:ind w:left="1440" w:hanging="360"/>
+      </w:pPr>
+    </w:lvl>
+    <w:lvl w:ilvl="2" w:tentative="1">
+      <w:start w:val="1"/>
+      <w:numFmt w:val="bullet"/>
+      <w:lvlText w:val=""/>
+      <w:lvlJc w:val="left"/>
+      <w:pPr>
+        <w:tabs>
+          <w:tab w:val="num" w:pos="2160"/>
+        </w:tabs>
+        <w:ind w:left="2160" w:hanging="360"/>
+      </w:pPr>
+      <w:rPr>
+        <w:rFonts w:ascii="Wingdings" w:hAnsi="Wingdings" w:hint="default"/>
+        <w:sz w:val="20"/>
+      </w:rPr>
+    </w:lvl>
+    <w:lvl w:ilvl="3" w:tentative="1">
+      <w:start w:val="1"/>
+      <w:numFmt w:val="bullet"/>
+      <w:lvlText w:val=""/>
+      <w:lvlJc w:val="left"/>
+      <w:pPr>
+        <w:tabs>
+          <w:tab w:val="num" w:pos="2880"/>
+        </w:tabs>
+        <w:ind w:left="2880" w:hanging="360"/>
+      </w:pPr>
+      <w:rPr>
+        <w:rFonts w:ascii="Wingdings" w:hAnsi="Wingdings" w:hint="default"/>
+        <w:sz w:val="20"/>
+      </w:rPr>
+    </w:lvl>
+    <w:lvl w:ilvl="4" w:tentative="1">
+      <w:start w:val="1"/>
+      <w:numFmt w:val="bullet"/>
+      <w:lvlText w:val=""/>
+      <w:lvlJc w:val="left"/>
+      <w:pPr>
+        <w:tabs>
+          <w:tab w:val="num" w:pos="3600"/>
+        </w:tabs>
+        <w:ind w:left="3600" w:hanging="360"/>
+      </w:pPr>
+      <w:rPr>
+        <w:rFonts w:ascii="Wingdings" w:hAnsi="Wingdings" w:hint="default"/>
+        <w:sz w:val="20"/>
+      </w:rPr>
+    </w:lvl>
+    <w:lvl w:ilvl="5" w:tentative="1">
+      <w:start w:val="1"/>
+      <w:numFmt w:val="bullet"/>
+      <w:lvlText w:val=""/>
+      <w:lvlJc w:val="left"/>
+      <w:pPr>
+        <w:tabs>
+          <w:tab w:val="num" w:pos="4320"/>
+        </w:tabs>
+        <w:ind w:left="4320" w:hanging="360"/>
+      </w:pPr>
+      <w:rPr>
+        <w:rFonts w:ascii="Wingdings" w:hAnsi="Wingdings" w:hint="default"/>
+        <w:sz w:val="20"/>
+      </w:rPr>
+    </w:lvl>
+    <w:lvl w:ilvl="6" w:tentative="1">
+      <w:start w:val="1"/>
+      <w:numFmt w:val="bullet"/>
+      <w:lvlText w:val=""/>
+      <w:lvlJc w:val="left"/>
+      <w:pPr>
+        <w:tabs>
+          <w:tab w:val="num" w:pos="5040"/>
+        </w:tabs>
+        <w:ind w:left="5040" w:hanging="360"/>
+      </w:pPr>
+      <w:rPr>
+        <w:rFonts w:ascii="Wingdings" w:hAnsi="Wingdings" w:hint="default"/>
+        <w:sz w:val="20"/>
+      </w:rPr>
+    </w:lvl>
+    <w:lvl w:ilvl="7" w:tentative="1">
+      <w:start w:val="1"/>
+      <w:numFmt w:val="bullet"/>
+      <w:lvlText w:val=""/>
+      <w:lvlJc w:val="left"/>
+      <w:pPr>
+        <w:tabs>
+          <w:tab w:val="num" w:pos="5760"/>
+        </w:tabs>
+        <w:ind w:left="5760" w:hanging="360"/>
+      </w:pPr>
+      <w:rPr>
+        <w:rFonts w:ascii="Wingdings" w:hAnsi="Wingdings" w:hint="default"/>
+        <w:sz w:val="20"/>
+      </w:rPr>
+    </w:lvl>
+    <w:lvl w:ilvl="8" w:tentative="1">
+      <w:start w:val="1"/>
+      <w:numFmt w:val="bullet"/>
+      <w:lvlText w:val=""/>
+      <w:lvlJc w:val="left"/>
+      <w:pPr>
+        <w:tabs>
+          <w:tab w:val="num" w:pos="6480"/>
+        </w:tabs>
+        <w:ind w:left="6480" w:hanging="360"/>
+      </w:pPr>
+      <w:rPr>
+        <w:rFonts w:ascii="Wingdings" w:hAnsi="Wingdings" w:hint="default"/>
+        <w:sz w:val="20"/>
+      </w:rPr>
+    </w:lvl>
+  </w:abstractNum>
+  <w:abstractNum w:abstractNumId="2" w15:restartNumberingAfterBreak="0">
+    <w:nsid w:val="224B60DF"/>
+    <w:multiLevelType w:val="multilevel"/>
+    <w:tmpl w:val="07849B0E"/>
+    <w:lvl w:ilvl="0">
+      <w:start w:val="1"/>
+      <w:numFmt w:val="bullet"/>
+      <w:lvlText w:val=""/>
+      <w:lvlJc w:val="left"/>
+      <w:pPr>
+        <w:tabs>
+          <w:tab w:val="num" w:pos="720"/>
+        </w:tabs>
+        <w:ind w:left="720" w:hanging="360"/>
+      </w:pPr>
+      <w:rPr>
+        <w:rFonts w:ascii="Symbol" w:hAnsi="Symbol" w:hint="default"/>
+        <w:sz w:val="20"/>
+      </w:rPr>
+    </w:lvl>
+    <w:lvl w:ilvl="1" w:tentative="1">
+      <w:start w:val="1"/>
+      <w:numFmt w:val="bullet"/>
+      <w:lvlText w:val="o"/>
+      <w:lvlJc w:val="left"/>
+      <w:pPr>
+        <w:tabs>
+          <w:tab w:val="num" w:pos="1440"/>
+        </w:tabs>
+        <w:ind w:left="1440" w:hanging="360"/>
+      </w:pPr>
+      <w:rPr>
+        <w:rFonts w:ascii="Courier New" w:hAnsi="Courier New" w:hint="default"/>
+        <w:sz w:val="20"/>
+      </w:rPr>
+    </w:lvl>
+    <w:lvl w:ilvl="2" w:tentative="1">
+      <w:start w:val="1"/>
+      <w:numFmt w:val="bullet"/>
+      <w:lvlText w:val=""/>
+      <w:lvlJc w:val="left"/>
+      <w:pPr>
+        <w:tabs>
+          <w:tab w:val="num" w:pos="2160"/>
+        </w:tabs>
+        <w:ind w:left="2160" w:hanging="360"/>
+      </w:pPr>
+      <w:rPr>
+        <w:rFonts w:ascii="Wingdings" w:hAnsi="Wingdings" w:hint="default"/>
+        <w:sz w:val="20"/>
+      </w:rPr>
+    </w:lvl>
+    <w:lvl w:ilvl="3" w:tentative="1">
+      <w:start w:val="1"/>
+      <w:numFmt w:val="bullet"/>
+      <w:lvlText w:val=""/>
+      <w:lvlJc w:val="left"/>
+      <w:pPr>
+        <w:tabs>
+          <w:tab w:val="num" w:pos="2880"/>
+        </w:tabs>
+        <w:ind w:left="2880" w:hanging="360"/>
+      </w:pPr>
+      <w:rPr>
+        <w:rFonts w:ascii="Wingdings" w:hAnsi="Wingdings" w:hint="default"/>
+        <w:sz w:val="20"/>
+      </w:rPr>
+    </w:lvl>
+    <w:lvl w:ilvl="4" w:tentative="1">
+      <w:start w:val="1"/>
+      <w:numFmt w:val="bullet"/>
+      <w:lvlText w:val=""/>
+      <w:lvlJc w:val="left"/>
+      <w:pPr>
+        <w:tabs>
+          <w:tab w:val="num" w:pos="3600"/>
+        </w:tabs>
+        <w:ind w:left="3600" w:hanging="360"/>
+      </w:pPr>
+      <w:rPr>
+        <w:rFonts w:ascii="Wingdings" w:hAnsi="Wingdings" w:hint="default"/>
+        <w:sz w:val="20"/>
+      </w:rPr>
+    </w:lvl>
+    <w:lvl w:ilvl="5" w:tentative="1">
+      <w:start w:val="1"/>
+      <w:numFmt w:val="bullet"/>
+      <w:lvlText w:val=""/>
+      <w:lvlJc w:val="left"/>
+      <w:pPr>
+        <w:tabs>
+          <w:tab w:val="num" w:pos="4320"/>
+        </w:tabs>
+        <w:ind w:left="4320" w:hanging="360"/>
+      </w:pPr>
+      <w:rPr>
+        <w:rFonts w:ascii="Wingdings" w:hAnsi="Wingdings" w:hint="default"/>
+        <w:sz w:val="20"/>
+      </w:rPr>
+    </w:lvl>
+    <w:lvl w:ilvl="6" w:tentative="1">
+      <w:start w:val="1"/>
+      <w:numFmt w:val="bullet"/>
+      <w:lvlText w:val=""/>
+      <w:lvlJc w:val="left"/>
+      <w:pPr>
+        <w:tabs>
+          <w:tab w:val="num" w:pos="5040"/>
+        </w:tabs>
+        <w:ind w:left="5040" w:hanging="360"/>
+      </w:pPr>
+      <w:rPr>
+        <w:rFonts w:ascii="Wingdings" w:hAnsi="Wingdings" w:hint="default"/>
+        <w:sz w:val="20"/>
+      </w:rPr>
+    </w:lvl>
+    <w:lvl w:ilvl="7" w:tentative="1">
+      <w:start w:val="1"/>
+      <w:numFmt w:val="bullet"/>
+      <w:lvlText w:val=""/>
+      <w:lvlJc w:val="left"/>
+      <w:pPr>
+        <w:tabs>
+          <w:tab w:val="num" w:pos="5760"/>
+        </w:tabs>
+        <w:ind w:left="5760" w:hanging="360"/>
+      </w:pPr>
+      <w:rPr>
+        <w:rFonts w:ascii="Wingdings" w:hAnsi="Wingdings" w:hint="default"/>
+        <w:sz w:val="20"/>
+      </w:rPr>
+    </w:lvl>
+    <w:lvl w:ilvl="8" w:tentative="1">
+      <w:start w:val="1"/>
+      <w:numFmt w:val="bullet"/>
+      <w:lvlText w:val=""/>
+      <w:lvlJc w:val="left"/>
+      <w:pPr>
+        <w:tabs>
+          <w:tab w:val="num" w:pos="6480"/>
+        </w:tabs>
+        <w:ind w:left="6480" w:hanging="360"/>
+      </w:pPr>
+      <w:rPr>
+        <w:rFonts w:ascii="Wingdings" w:hAnsi="Wingdings" w:hint="default"/>
+        <w:sz w:val="20"/>
+      </w:rPr>
+    </w:lvl>
+  </w:abstractNum>
+  <w:abstractNum w:abstractNumId="3" w15:restartNumberingAfterBreak="0">
+    <w:nsid w:val="3A702856"/>
+    <w:multiLevelType w:val="multilevel"/>
+    <w:tmpl w:val="700630AC"/>
+    <w:lvl w:ilvl="0">
+      <w:start w:val="1"/>
+      <w:numFmt w:val="decimal"/>
+      <w:lvlText w:val="%1."/>
+      <w:lvlJc w:val="left"/>
+      <w:pPr>
+        <w:tabs>
+          <w:tab w:val="num" w:pos="720"/>
+        </w:tabs>
+        <w:ind w:left="720" w:hanging="360"/>
+      </w:pPr>
+    </w:lvl>
+    <w:lvl w:ilvl="1" w:tentative="1">
+      <w:start w:val="1"/>
+      <w:numFmt w:val="decimal"/>
+      <w:lvlText w:val="%2."/>
+      <w:lvlJc w:val="left"/>
+      <w:pPr>
+        <w:tabs>
+          <w:tab w:val="num" w:pos="1440"/>
+        </w:tabs>
+        <w:ind w:left="1440" w:hanging="360"/>
+      </w:pPr>
+    </w:lvl>
+    <w:lvl w:ilvl="2" w:tentative="1">
+      <w:start w:val="1"/>
+      <w:numFmt w:val="decimal"/>
+      <w:lvlText w:val="%3."/>
+      <w:lvlJc w:val="left"/>
+      <w:pPr>
+        <w:tabs>
+          <w:tab w:val="num" w:pos="2160"/>
+        </w:tabs>
+        <w:ind w:left="2160" w:hanging="360"/>
+      </w:pPr>
+    </w:lvl>
+    <w:lvl w:ilvl="3" w:tentative="1">
+      <w:start w:val="1"/>
+      <w:numFmt w:val="decimal"/>
+      <w:lvlText w:val="%4."/>
+      <w:lvlJc w:val="left"/>
+      <w:pPr>
+        <w:tabs>
+          <w:tab w:val="num" w:pos="2880"/>
+        </w:tabs>
+        <w:ind w:left="2880" w:hanging="360"/>
+      </w:pPr>
+    </w:lvl>
+    <w:lvl w:ilvl="4" w:tentative="1">
+      <w:start w:val="1"/>
+      <w:numFmt w:val="decimal"/>
+      <w:lvlText w:val="%5."/>
+      <w:lvlJc w:val="left"/>
+      <w:pPr>
+        <w:tabs>
+          <w:tab w:val="num" w:pos="3600"/>
+        </w:tabs>
+        <w:ind w:left="3600" w:hanging="360"/>
+      </w:pPr>
+    </w:lvl>
+    <w:lvl w:ilvl="5" w:tentative="1">
+      <w:start w:val="1"/>
+      <w:numFmt w:val="decimal"/>
+      <w:lvlText w:val="%6."/>
+      <w:lvlJc w:val="left"/>
+      <w:pPr>
+        <w:tabs>
+          <w:tab w:val="num" w:pos="4320"/>
+        </w:tabs>
+        <w:ind w:left="4320" w:hanging="360"/>
+      </w:pPr>
+    </w:lvl>
+    <w:lvl w:ilvl="6" w:tentative="1">
+      <w:start w:val="1"/>
+      <w:numFmt w:val="decimal"/>
+      <w:lvlText w:val="%7."/>
+      <w:lvlJc w:val="left"/>
+      <w:pPr>
+        <w:tabs>
+          <w:tab w:val="num" w:pos="5040"/>
+        </w:tabs>
+        <w:ind w:left="5040" w:hanging="360"/>
+      </w:pPr>
+    </w:lvl>
+    <w:lvl w:ilvl="7" w:tentative="1">
+      <w:start w:val="1"/>
+      <w:numFmt w:val="decimal"/>
+      <w:lvlText w:val="%8."/>
+      <w:lvlJc w:val="left"/>
+      <w:pPr>
+        <w:tabs>
+          <w:tab w:val="num" w:pos="5760"/>
+        </w:tabs>
+        <w:ind w:left="5760" w:hanging="360"/>
+      </w:pPr>
+    </w:lvl>
+    <w:lvl w:ilvl="8" w:tentative="1">
+      <w:start w:val="1"/>
+      <w:numFmt w:val="decimal"/>
+      <w:lvlText w:val="%9."/>
+      <w:lvlJc w:val="left"/>
+      <w:pPr>
+        <w:tabs>
+          <w:tab w:val="num" w:pos="6480"/>
+        </w:tabs>
+        <w:ind w:left="6480" w:hanging="360"/>
+      </w:pPr>
+    </w:lvl>
+  </w:abstractNum>
+  <w:abstractNum w:abstractNumId="4" w15:restartNumberingAfterBreak="0">
     <w:nsid w:val="5AF5431E"/>
     <w:multiLevelType w:val="multilevel"/>
     <w:tmpl w:val="3F8E89EE"/>
@@ -1474,7 +4866,7 @@
       </w:rPr>
     </w:lvl>
   </w:abstractNum>
-  <w:abstractNum w:abstractNumId="1" w15:restartNumberingAfterBreak="0">
+  <w:abstractNum w:abstractNumId="5" w15:restartNumberingAfterBreak="0">
     <w:nsid w:val="60AE3D81"/>
     <w:multiLevelType w:val="multilevel"/>
     <w:tmpl w:val="649E99EA"/>
@@ -1623,7 +5015,7 @@
       </w:rPr>
     </w:lvl>
   </w:abstractNum>
-  <w:abstractNum w:abstractNumId="2" w15:restartNumberingAfterBreak="0">
+  <w:abstractNum w:abstractNumId="6" w15:restartNumberingAfterBreak="0">
     <w:nsid w:val="6114793E"/>
     <w:multiLevelType w:val="multilevel"/>
     <w:tmpl w:val="4766749E"/>
@@ -1772,7 +5164,156 @@
       </w:rPr>
     </w:lvl>
   </w:abstractNum>
-  <w:abstractNum w:abstractNumId="3" w15:restartNumberingAfterBreak="0">
+  <w:abstractNum w:abstractNumId="7" w15:restartNumberingAfterBreak="0">
+    <w:nsid w:val="62AB1792"/>
+    <w:multiLevelType w:val="multilevel"/>
+    <w:tmpl w:val="D5220726"/>
+    <w:lvl w:ilvl="0">
+      <w:start w:val="1"/>
+      <w:numFmt w:val="bullet"/>
+      <w:lvlText w:val=""/>
+      <w:lvlJc w:val="left"/>
+      <w:pPr>
+        <w:tabs>
+          <w:tab w:val="num" w:pos="720"/>
+        </w:tabs>
+        <w:ind w:left="720" w:hanging="360"/>
+      </w:pPr>
+      <w:rPr>
+        <w:rFonts w:ascii="Symbol" w:hAnsi="Symbol" w:hint="default"/>
+        <w:sz w:val="20"/>
+      </w:rPr>
+    </w:lvl>
+    <w:lvl w:ilvl="1">
+      <w:start w:val="1"/>
+      <w:numFmt w:val="bullet"/>
+      <w:lvlText w:val="o"/>
+      <w:lvlJc w:val="left"/>
+      <w:pPr>
+        <w:tabs>
+          <w:tab w:val="num" w:pos="1440"/>
+        </w:tabs>
+        <w:ind w:left="1440" w:hanging="360"/>
+      </w:pPr>
+      <w:rPr>
+        <w:rFonts w:ascii="Courier New" w:hAnsi="Courier New" w:hint="default"/>
+        <w:sz w:val="20"/>
+      </w:rPr>
+    </w:lvl>
+    <w:lvl w:ilvl="2" w:tentative="1">
+      <w:start w:val="1"/>
+      <w:numFmt w:val="bullet"/>
+      <w:lvlText w:val=""/>
+      <w:lvlJc w:val="left"/>
+      <w:pPr>
+        <w:tabs>
+          <w:tab w:val="num" w:pos="2160"/>
+        </w:tabs>
+        <w:ind w:left="2160" w:hanging="360"/>
+      </w:pPr>
+      <w:rPr>
+        <w:rFonts w:ascii="Wingdings" w:hAnsi="Wingdings" w:hint="default"/>
+        <w:sz w:val="20"/>
+      </w:rPr>
+    </w:lvl>
+    <w:lvl w:ilvl="3" w:tentative="1">
+      <w:start w:val="1"/>
+      <w:numFmt w:val="bullet"/>
+      <w:lvlText w:val=""/>
+      <w:lvlJc w:val="left"/>
+      <w:pPr>
+        <w:tabs>
+          <w:tab w:val="num" w:pos="2880"/>
+        </w:tabs>
+        <w:ind w:left="2880" w:hanging="360"/>
+      </w:pPr>
+      <w:rPr>
+        <w:rFonts w:ascii="Wingdings" w:hAnsi="Wingdings" w:hint="default"/>
+        <w:sz w:val="20"/>
+      </w:rPr>
+    </w:lvl>
+    <w:lvl w:ilvl="4" w:tentative="1">
+      <w:start w:val="1"/>
+      <w:numFmt w:val="bullet"/>
+      <w:lvlText w:val=""/>
+      <w:lvlJc w:val="left"/>
+      <w:pPr>
+        <w:tabs>
+          <w:tab w:val="num" w:pos="3600"/>
+        </w:tabs>
+        <w:ind w:left="3600" w:hanging="360"/>
+      </w:pPr>
+      <w:rPr>
+        <w:rFonts w:ascii="Wingdings" w:hAnsi="Wingdings" w:hint="default"/>
+        <w:sz w:val="20"/>
+      </w:rPr>
+    </w:lvl>
+    <w:lvl w:ilvl="5" w:tentative="1">
+      <w:start w:val="1"/>
+      <w:numFmt w:val="bullet"/>
+      <w:lvlText w:val=""/>
+      <w:lvlJc w:val="left"/>
+      <w:pPr>
+        <w:tabs>
+          <w:tab w:val="num" w:pos="4320"/>
+        </w:tabs>
+        <w:ind w:left="4320" w:hanging="360"/>
+      </w:pPr>
+      <w:rPr>
+        <w:rFonts w:ascii="Wingdings" w:hAnsi="Wingdings" w:hint="default"/>
+        <w:sz w:val="20"/>
+      </w:rPr>
+    </w:lvl>
+    <w:lvl w:ilvl="6" w:tentative="1">
+      <w:start w:val="1"/>
+      <w:numFmt w:val="bullet"/>
+      <w:lvlText w:val=""/>
+      <w:lvlJc w:val="left"/>
+      <w:pPr>
+        <w:tabs>
+          <w:tab w:val="num" w:pos="5040"/>
+        </w:tabs>
+        <w:ind w:left="5040" w:hanging="360"/>
+      </w:pPr>
+      <w:rPr>
+        <w:rFonts w:ascii="Wingdings" w:hAnsi="Wingdings" w:hint="default"/>
+        <w:sz w:val="20"/>
+      </w:rPr>
+    </w:lvl>
+    <w:lvl w:ilvl="7" w:tentative="1">
+      <w:start w:val="1"/>
+      <w:numFmt w:val="bullet"/>
+      <w:lvlText w:val=""/>
+      <w:lvlJc w:val="left"/>
+      <w:pPr>
+        <w:tabs>
+          <w:tab w:val="num" w:pos="5760"/>
+        </w:tabs>
+        <w:ind w:left="5760" w:hanging="360"/>
+      </w:pPr>
+      <w:rPr>
+        <w:rFonts w:ascii="Wingdings" w:hAnsi="Wingdings" w:hint="default"/>
+        <w:sz w:val="20"/>
+      </w:rPr>
+    </w:lvl>
+    <w:lvl w:ilvl="8" w:tentative="1">
+      <w:start w:val="1"/>
+      <w:numFmt w:val="bullet"/>
+      <w:lvlText w:val=""/>
+      <w:lvlJc w:val="left"/>
+      <w:pPr>
+        <w:tabs>
+          <w:tab w:val="num" w:pos="6480"/>
+        </w:tabs>
+        <w:ind w:left="6480" w:hanging="360"/>
+      </w:pPr>
+      <w:rPr>
+        <w:rFonts w:ascii="Wingdings" w:hAnsi="Wingdings" w:hint="default"/>
+        <w:sz w:val="20"/>
+      </w:rPr>
+    </w:lvl>
+  </w:abstractNum>
+  <w:abstractNum w:abstractNumId="8" w15:restartNumberingAfterBreak="0">
     <w:nsid w:val="650A0BB8"/>
     <w:multiLevelType w:val="multilevel"/>
     <w:tmpl w:val="94AAE0F4"/>
@@ -1921,7 +5462,599 @@
       </w:rPr>
     </w:lvl>
   </w:abstractNum>
-  <w:abstractNum w:abstractNumId="4" w15:restartNumberingAfterBreak="0">
+  <w:abstractNum w:abstractNumId="9" w15:restartNumberingAfterBreak="0">
+    <w:nsid w:val="659D1408"/>
+    <w:multiLevelType w:val="multilevel"/>
+    <w:tmpl w:val="56CE7510"/>
+    <w:lvl w:ilvl="0">
+      <w:start w:val="1"/>
+      <w:numFmt w:val="bullet"/>
+      <w:lvlText w:val=""/>
+      <w:lvlJc w:val="left"/>
+      <w:pPr>
+        <w:tabs>
+          <w:tab w:val="num" w:pos="720"/>
+        </w:tabs>
+        <w:ind w:left="720" w:hanging="360"/>
+      </w:pPr>
+      <w:rPr>
+        <w:rFonts w:ascii="Symbol" w:hAnsi="Symbol" w:hint="default"/>
+        <w:sz w:val="20"/>
+      </w:rPr>
+    </w:lvl>
+    <w:lvl w:ilvl="1" w:tentative="1">
+      <w:start w:val="1"/>
+      <w:numFmt w:val="bullet"/>
+      <w:lvlText w:val="o"/>
+      <w:lvlJc w:val="left"/>
+      <w:pPr>
+        <w:tabs>
+          <w:tab w:val="num" w:pos="1440"/>
+        </w:tabs>
+        <w:ind w:left="1440" w:hanging="360"/>
+      </w:pPr>
+      <w:rPr>
+        <w:rFonts w:ascii="Courier New" w:hAnsi="Courier New" w:hint="default"/>
+        <w:sz w:val="20"/>
+      </w:rPr>
+    </w:lvl>
+    <w:lvl w:ilvl="2" w:tentative="1">
+      <w:start w:val="1"/>
+      <w:numFmt w:val="bullet"/>
+      <w:lvlText w:val=""/>
+      <w:lvlJc w:val="left"/>
+      <w:pPr>
+        <w:tabs>
+          <w:tab w:val="num" w:pos="2160"/>
+        </w:tabs>
+        <w:ind w:left="2160" w:hanging="360"/>
+      </w:pPr>
+      <w:rPr>
+        <w:rFonts w:ascii="Wingdings" w:hAnsi="Wingdings" w:hint="default"/>
+        <w:sz w:val="20"/>
+      </w:rPr>
+    </w:lvl>
+    <w:lvl w:ilvl="3" w:tentative="1">
+      <w:start w:val="1"/>
+      <w:numFmt w:val="bullet"/>
+      <w:lvlText w:val=""/>
+      <w:lvlJc w:val="left"/>
+      <w:pPr>
+        <w:tabs>
+          <w:tab w:val="num" w:pos="2880"/>
+        </w:tabs>
+        <w:ind w:left="2880" w:hanging="360"/>
+      </w:pPr>
+      <w:rPr>
+        <w:rFonts w:ascii="Wingdings" w:hAnsi="Wingdings" w:hint="default"/>
+        <w:sz w:val="20"/>
+      </w:rPr>
+    </w:lvl>
+    <w:lvl w:ilvl="4" w:tentative="1">
+      <w:start w:val="1"/>
+      <w:numFmt w:val="bullet"/>
+      <w:lvlText w:val=""/>
+      <w:lvlJc w:val="left"/>
+      <w:pPr>
+        <w:tabs>
+          <w:tab w:val="num" w:pos="3600"/>
+        </w:tabs>
+        <w:ind w:left="3600" w:hanging="360"/>
+      </w:pPr>
+      <w:rPr>
+        <w:rFonts w:ascii="Wingdings" w:hAnsi="Wingdings" w:hint="default"/>
+        <w:sz w:val="20"/>
+      </w:rPr>
+    </w:lvl>
+    <w:lvl w:ilvl="5" w:tentative="1">
+      <w:start w:val="1"/>
+      <w:numFmt w:val="bullet"/>
+      <w:lvlText w:val=""/>
+      <w:lvlJc w:val="left"/>
+      <w:pPr>
+        <w:tabs>
+          <w:tab w:val="num" w:pos="4320"/>
+        </w:tabs>
+        <w:ind w:left="4320" w:hanging="360"/>
+      </w:pPr>
+      <w:rPr>
+        <w:rFonts w:ascii="Wingdings" w:hAnsi="Wingdings" w:hint="default"/>
+        <w:sz w:val="20"/>
+      </w:rPr>
+    </w:lvl>
+    <w:lvl w:ilvl="6" w:tentative="1">
+      <w:start w:val="1"/>
+      <w:numFmt w:val="bullet"/>
+      <w:lvlText w:val=""/>
+      <w:lvlJc w:val="left"/>
+      <w:pPr>
+        <w:tabs>
+          <w:tab w:val="num" w:pos="5040"/>
+        </w:tabs>
+        <w:ind w:left="5040" w:hanging="360"/>
+      </w:pPr>
+      <w:rPr>
+        <w:rFonts w:ascii="Wingdings" w:hAnsi="Wingdings" w:hint="default"/>
+        <w:sz w:val="20"/>
+      </w:rPr>
+    </w:lvl>
+    <w:lvl w:ilvl="7" w:tentative="1">
+      <w:start w:val="1"/>
+      <w:numFmt w:val="bullet"/>
+      <w:lvlText w:val=""/>
+      <w:lvlJc w:val="left"/>
+      <w:pPr>
+        <w:tabs>
+          <w:tab w:val="num" w:pos="5760"/>
+        </w:tabs>
+        <w:ind w:left="5760" w:hanging="360"/>
+      </w:pPr>
+      <w:rPr>
+        <w:rFonts w:ascii="Wingdings" w:hAnsi="Wingdings" w:hint="default"/>
+        <w:sz w:val="20"/>
+      </w:rPr>
+    </w:lvl>
+    <w:lvl w:ilvl="8" w:tentative="1">
+      <w:start w:val="1"/>
+      <w:numFmt w:val="bullet"/>
+      <w:lvlText w:val=""/>
+      <w:lvlJc w:val="left"/>
+      <w:pPr>
+        <w:tabs>
+          <w:tab w:val="num" w:pos="6480"/>
+        </w:tabs>
+        <w:ind w:left="6480" w:hanging="360"/>
+      </w:pPr>
+      <w:rPr>
+        <w:rFonts w:ascii="Wingdings" w:hAnsi="Wingdings" w:hint="default"/>
+        <w:sz w:val="20"/>
+      </w:rPr>
+    </w:lvl>
+  </w:abstractNum>
+  <w:abstractNum w:abstractNumId="10" w15:restartNumberingAfterBreak="0">
+    <w:nsid w:val="69372FBA"/>
+    <w:multiLevelType w:val="multilevel"/>
+    <w:tmpl w:val="71A67E0E"/>
+    <w:lvl w:ilvl="0">
+      <w:start w:val="1"/>
+      <w:numFmt w:val="bullet"/>
+      <w:lvlText w:val=""/>
+      <w:lvlJc w:val="left"/>
+      <w:pPr>
+        <w:tabs>
+          <w:tab w:val="num" w:pos="720"/>
+        </w:tabs>
+        <w:ind w:left="720" w:hanging="360"/>
+      </w:pPr>
+      <w:rPr>
+        <w:rFonts w:ascii="Symbol" w:hAnsi="Symbol" w:hint="default"/>
+        <w:sz w:val="20"/>
+      </w:rPr>
+    </w:lvl>
+    <w:lvl w:ilvl="1" w:tentative="1">
+      <w:start w:val="1"/>
+      <w:numFmt w:val="bullet"/>
+      <w:lvlText w:val="o"/>
+      <w:lvlJc w:val="left"/>
+      <w:pPr>
+        <w:tabs>
+          <w:tab w:val="num" w:pos="1440"/>
+        </w:tabs>
+        <w:ind w:left="1440" w:hanging="360"/>
+      </w:pPr>
+      <w:rPr>
+        <w:rFonts w:ascii="Courier New" w:hAnsi="Courier New" w:hint="default"/>
+        <w:sz w:val="20"/>
+      </w:rPr>
+    </w:lvl>
+    <w:lvl w:ilvl="2" w:tentative="1">
+      <w:start w:val="1"/>
+      <w:numFmt w:val="bullet"/>
+      <w:lvlText w:val=""/>
+      <w:lvlJc w:val="left"/>
+      <w:pPr>
+        <w:tabs>
+          <w:tab w:val="num" w:pos="2160"/>
+        </w:tabs>
+        <w:ind w:left="2160" w:hanging="360"/>
+      </w:pPr>
+      <w:rPr>
+        <w:rFonts w:ascii="Wingdings" w:hAnsi="Wingdings" w:hint="default"/>
+        <w:sz w:val="20"/>
+      </w:rPr>
+    </w:lvl>
+    <w:lvl w:ilvl="3" w:tentative="1">
+      <w:start w:val="1"/>
+      <w:numFmt w:val="bullet"/>
+      <w:lvlText w:val=""/>
+      <w:lvlJc w:val="left"/>
+      <w:pPr>
+        <w:tabs>
+          <w:tab w:val="num" w:pos="2880"/>
+        </w:tabs>
+        <w:ind w:left="2880" w:hanging="360"/>
+      </w:pPr>
+      <w:rPr>
+        <w:rFonts w:ascii="Wingdings" w:hAnsi="Wingdings" w:hint="default"/>
+        <w:sz w:val="20"/>
+      </w:rPr>
+    </w:lvl>
+    <w:lvl w:ilvl="4" w:tentative="1">
+      <w:start w:val="1"/>
+      <w:numFmt w:val="bullet"/>
+      <w:lvlText w:val=""/>
+      <w:lvlJc w:val="left"/>
+      <w:pPr>
+        <w:tabs>
+          <w:tab w:val="num" w:pos="3600"/>
+        </w:tabs>
+        <w:ind w:left="3600" w:hanging="360"/>
+      </w:pPr>
+      <w:rPr>
+        <w:rFonts w:ascii="Wingdings" w:hAnsi="Wingdings" w:hint="default"/>
+        <w:sz w:val="20"/>
+      </w:rPr>
+    </w:lvl>
+    <w:lvl w:ilvl="5" w:tentative="1">
+      <w:start w:val="1"/>
+      <w:numFmt w:val="bullet"/>
+      <w:lvlText w:val=""/>
+      <w:lvlJc w:val="left"/>
+      <w:pPr>
+        <w:tabs>
+          <w:tab w:val="num" w:pos="4320"/>
+        </w:tabs>
+        <w:ind w:left="4320" w:hanging="360"/>
+      </w:pPr>
+      <w:rPr>
+        <w:rFonts w:ascii="Wingdings" w:hAnsi="Wingdings" w:hint="default"/>
+        <w:sz w:val="20"/>
+      </w:rPr>
+    </w:lvl>
+    <w:lvl w:ilvl="6" w:tentative="1">
+      <w:start w:val="1"/>
+      <w:numFmt w:val="bullet"/>
+      <w:lvlText w:val=""/>
+      <w:lvlJc w:val="left"/>
+      <w:pPr>
+        <w:tabs>
+          <w:tab w:val="num" w:pos="5040"/>
+        </w:tabs>
+        <w:ind w:left="5040" w:hanging="360"/>
+      </w:pPr>
+      <w:rPr>
+        <w:rFonts w:ascii="Wingdings" w:hAnsi="Wingdings" w:hint="default"/>
+        <w:sz w:val="20"/>
+      </w:rPr>
+    </w:lvl>
+    <w:lvl w:ilvl="7" w:tentative="1">
+      <w:start w:val="1"/>
+      <w:numFmt w:val="bullet"/>
+      <w:lvlText w:val=""/>
+      <w:lvlJc w:val="left"/>
+      <w:pPr>
+        <w:tabs>
+          <w:tab w:val="num" w:pos="5760"/>
+        </w:tabs>
+        <w:ind w:left="5760" w:hanging="360"/>
+      </w:pPr>
+      <w:rPr>
+        <w:rFonts w:ascii="Wingdings" w:hAnsi="Wingdings" w:hint="default"/>
+        <w:sz w:val="20"/>
+      </w:rPr>
+    </w:lvl>
+    <w:lvl w:ilvl="8" w:tentative="1">
+      <w:start w:val="1"/>
+      <w:numFmt w:val="bullet"/>
+      <w:lvlText w:val=""/>
+      <w:lvlJc w:val="left"/>
+      <w:pPr>
+        <w:tabs>
+          <w:tab w:val="num" w:pos="6480"/>
+        </w:tabs>
+        <w:ind w:left="6480" w:hanging="360"/>
+      </w:pPr>
+      <w:rPr>
+        <w:rFonts w:ascii="Wingdings" w:hAnsi="Wingdings" w:hint="default"/>
+        <w:sz w:val="20"/>
+      </w:rPr>
+    </w:lvl>
+  </w:abstractNum>
+  <w:abstractNum w:abstractNumId="11" w15:restartNumberingAfterBreak="0">
+    <w:nsid w:val="6B113B49"/>
+    <w:multiLevelType w:val="multilevel"/>
+    <w:tmpl w:val="62E200B2"/>
+    <w:lvl w:ilvl="0">
+      <w:start w:val="1"/>
+      <w:numFmt w:val="bullet"/>
+      <w:lvlText w:val=""/>
+      <w:lvlJc w:val="left"/>
+      <w:pPr>
+        <w:tabs>
+          <w:tab w:val="num" w:pos="720"/>
+        </w:tabs>
+        <w:ind w:left="720" w:hanging="360"/>
+      </w:pPr>
+      <w:rPr>
+        <w:rFonts w:ascii="Symbol" w:hAnsi="Symbol" w:hint="default"/>
+        <w:sz w:val="20"/>
+      </w:rPr>
+    </w:lvl>
+    <w:lvl w:ilvl="1" w:tentative="1">
+      <w:start w:val="1"/>
+      <w:numFmt w:val="bullet"/>
+      <w:lvlText w:val="o"/>
+      <w:lvlJc w:val="left"/>
+      <w:pPr>
+        <w:tabs>
+          <w:tab w:val="num" w:pos="1440"/>
+        </w:tabs>
+        <w:ind w:left="1440" w:hanging="360"/>
+      </w:pPr>
+      <w:rPr>
+        <w:rFonts w:ascii="Courier New" w:hAnsi="Courier New" w:hint="default"/>
+        <w:sz w:val="20"/>
+      </w:rPr>
+    </w:lvl>
+    <w:lvl w:ilvl="2" w:tentative="1">
+      <w:start w:val="1"/>
+      <w:numFmt w:val="bullet"/>
+      <w:lvlText w:val=""/>
+      <w:lvlJc w:val="left"/>
+      <w:pPr>
+        <w:tabs>
+          <w:tab w:val="num" w:pos="2160"/>
+        </w:tabs>
+        <w:ind w:left="2160" w:hanging="360"/>
+      </w:pPr>
+      <w:rPr>
+        <w:rFonts w:ascii="Wingdings" w:hAnsi="Wingdings" w:hint="default"/>
+        <w:sz w:val="20"/>
+      </w:rPr>
+    </w:lvl>
+    <w:lvl w:ilvl="3" w:tentative="1">
+      <w:start w:val="1"/>
+      <w:numFmt w:val="bullet"/>
+      <w:lvlText w:val=""/>
+      <w:lvlJc w:val="left"/>
+      <w:pPr>
+        <w:tabs>
+          <w:tab w:val="num" w:pos="2880"/>
+        </w:tabs>
+        <w:ind w:left="2880" w:hanging="360"/>
+      </w:pPr>
+      <w:rPr>
+        <w:rFonts w:ascii="Wingdings" w:hAnsi="Wingdings" w:hint="default"/>
+        <w:sz w:val="20"/>
+      </w:rPr>
+    </w:lvl>
+    <w:lvl w:ilvl="4" w:tentative="1">
+      <w:start w:val="1"/>
+      <w:numFmt w:val="bullet"/>
+      <w:lvlText w:val=""/>
+      <w:lvlJc w:val="left"/>
+      <w:pPr>
+        <w:tabs>
+          <w:tab w:val="num" w:pos="3600"/>
+        </w:tabs>
+        <w:ind w:left="3600" w:hanging="360"/>
+      </w:pPr>
+      <w:rPr>
+        <w:rFonts w:ascii="Wingdings" w:hAnsi="Wingdings" w:hint="default"/>
+        <w:sz w:val="20"/>
+      </w:rPr>
+    </w:lvl>
+    <w:lvl w:ilvl="5" w:tentative="1">
+      <w:start w:val="1"/>
+      <w:numFmt w:val="bullet"/>
+      <w:lvlText w:val=""/>
+      <w:lvlJc w:val="left"/>
+      <w:pPr>
+        <w:tabs>
+          <w:tab w:val="num" w:pos="4320"/>
+        </w:tabs>
+        <w:ind w:left="4320" w:hanging="360"/>
+      </w:pPr>
+      <w:rPr>
+        <w:rFonts w:ascii="Wingdings" w:hAnsi="Wingdings" w:hint="default"/>
+        <w:sz w:val="20"/>
+      </w:rPr>
+    </w:lvl>
+    <w:lvl w:ilvl="6" w:tentative="1">
+      <w:start w:val="1"/>
+      <w:numFmt w:val="bullet"/>
+      <w:lvlText w:val=""/>
+      <w:lvlJc w:val="left"/>
+      <w:pPr>
+        <w:tabs>
+          <w:tab w:val="num" w:pos="5040"/>
+        </w:tabs>
+        <w:ind w:left="5040" w:hanging="360"/>
+      </w:pPr>
+      <w:rPr>
+        <w:rFonts w:ascii="Wingdings" w:hAnsi="Wingdings" w:hint="default"/>
+        <w:sz w:val="20"/>
+      </w:rPr>
+    </w:lvl>
+    <w:lvl w:ilvl="7" w:tentative="1">
+      <w:start w:val="1"/>
+      <w:numFmt w:val="bullet"/>
+      <w:lvlText w:val=""/>
+      <w:lvlJc w:val="left"/>
+      <w:pPr>
+        <w:tabs>
+          <w:tab w:val="num" w:pos="5760"/>
+        </w:tabs>
+        <w:ind w:left="5760" w:hanging="360"/>
+      </w:pPr>
+      <w:rPr>
+        <w:rFonts w:ascii="Wingdings" w:hAnsi="Wingdings" w:hint="default"/>
+        <w:sz w:val="20"/>
+      </w:rPr>
+    </w:lvl>
+    <w:lvl w:ilvl="8" w:tentative="1">
+      <w:start w:val="1"/>
+      <w:numFmt w:val="bullet"/>
+      <w:lvlText w:val=""/>
+      <w:lvlJc w:val="left"/>
+      <w:pPr>
+        <w:tabs>
+          <w:tab w:val="num" w:pos="6480"/>
+        </w:tabs>
+        <w:ind w:left="6480" w:hanging="360"/>
+      </w:pPr>
+      <w:rPr>
+        <w:rFonts w:ascii="Wingdings" w:hAnsi="Wingdings" w:hint="default"/>
+        <w:sz w:val="20"/>
+      </w:rPr>
+    </w:lvl>
+  </w:abstractNum>
+  <w:abstractNum w:abstractNumId="12" w15:restartNumberingAfterBreak="0">
+    <w:nsid w:val="72BE3AB8"/>
+    <w:multiLevelType w:val="multilevel"/>
+    <w:tmpl w:val="D9E8265E"/>
+    <w:lvl w:ilvl="0">
+      <w:start w:val="1"/>
+      <w:numFmt w:val="bullet"/>
+      <w:lvlText w:val=""/>
+      <w:lvlJc w:val="left"/>
+      <w:pPr>
+        <w:tabs>
+          <w:tab w:val="num" w:pos="720"/>
+        </w:tabs>
+        <w:ind w:left="720" w:hanging="360"/>
+      </w:pPr>
+      <w:rPr>
+        <w:rFonts w:ascii="Symbol" w:hAnsi="Symbol" w:hint="default"/>
+        <w:sz w:val="20"/>
+      </w:rPr>
+    </w:lvl>
+    <w:lvl w:ilvl="1">
+      <w:start w:val="1"/>
+      <w:numFmt w:val="decimal"/>
+      <w:lvlText w:val="%2."/>
+      <w:lvlJc w:val="left"/>
+      <w:pPr>
+        <w:tabs>
+          <w:tab w:val="num" w:pos="1440"/>
+        </w:tabs>
+        <w:ind w:left="1440" w:hanging="360"/>
+      </w:pPr>
+    </w:lvl>
+    <w:lvl w:ilvl="2" w:tentative="1">
+      <w:start w:val="1"/>
+      <w:numFmt w:val="bullet"/>
+      <w:lvlText w:val=""/>
+      <w:lvlJc w:val="left"/>
+      <w:pPr>
+        <w:tabs>
+          <w:tab w:val="num" w:pos="2160"/>
+        </w:tabs>
+        <w:ind w:left="2160" w:hanging="360"/>
+      </w:pPr>
+      <w:rPr>
+        <w:rFonts w:ascii="Wingdings" w:hAnsi="Wingdings" w:hint="default"/>
+        <w:sz w:val="20"/>
+      </w:rPr>
+    </w:lvl>
+    <w:lvl w:ilvl="3" w:tentative="1">
+      <w:start w:val="1"/>
+      <w:numFmt w:val="bullet"/>
+      <w:lvlText w:val=""/>
+      <w:lvlJc w:val="left"/>
+      <w:pPr>
+        <w:tabs>
+          <w:tab w:val="num" w:pos="2880"/>
+        </w:tabs>
+        <w:ind w:left="2880" w:hanging="360"/>
+      </w:pPr>
+      <w:rPr>
+        <w:rFonts w:ascii="Wingdings" w:hAnsi="Wingdings" w:hint="default"/>
+        <w:sz w:val="20"/>
+      </w:rPr>
+    </w:lvl>
+    <w:lvl w:ilvl="4" w:tentative="1">
+      <w:start w:val="1"/>
+      <w:numFmt w:val="bullet"/>
+      <w:lvlText w:val=""/>
+      <w:lvlJc w:val="left"/>
+      <w:pPr>
+        <w:tabs>
+          <w:tab w:val="num" w:pos="3600"/>
+        </w:tabs>
+        <w:ind w:left="3600" w:hanging="360"/>
+      </w:pPr>
+      <w:rPr>
+        <w:rFonts w:ascii="Wingdings" w:hAnsi="Wingdings" w:hint="default"/>
+        <w:sz w:val="20"/>
+      </w:rPr>
+    </w:lvl>
+    <w:lvl w:ilvl="5" w:tentative="1">
+      <w:start w:val="1"/>
+      <w:numFmt w:val="bullet"/>
+      <w:lvlText w:val=""/>
+      <w:lvlJc w:val="left"/>
+      <w:pPr>
+        <w:tabs>
+          <w:tab w:val="num" w:pos="4320"/>
+        </w:tabs>
+        <w:ind w:left="4320" w:hanging="360"/>
+      </w:pPr>
+      <w:rPr>
+        <w:rFonts w:ascii="Wingdings" w:hAnsi="Wingdings" w:hint="default"/>
+        <w:sz w:val="20"/>
+      </w:rPr>
+    </w:lvl>
+    <w:lvl w:ilvl="6" w:tentative="1">
+      <w:start w:val="1"/>
+      <w:numFmt w:val="bullet"/>
+      <w:lvlText w:val=""/>
+      <w:lvlJc w:val="left"/>
+      <w:pPr>
+        <w:tabs>
+          <w:tab w:val="num" w:pos="5040"/>
+        </w:tabs>
+        <w:ind w:left="5040" w:hanging="360"/>
+      </w:pPr>
+      <w:rPr>
+        <w:rFonts w:ascii="Wingdings" w:hAnsi="Wingdings" w:hint="default"/>
+        <w:sz w:val="20"/>
+      </w:rPr>
+    </w:lvl>
+    <w:lvl w:ilvl="7" w:tentative="1">
+      <w:start w:val="1"/>
+      <w:numFmt w:val="bullet"/>
+      <w:lvlText w:val=""/>
+      <w:lvlJc w:val="left"/>
+      <w:pPr>
+        <w:tabs>
+          <w:tab w:val="num" w:pos="5760"/>
+        </w:tabs>
+        <w:ind w:left="5760" w:hanging="360"/>
+      </w:pPr>
+      <w:rPr>
+        <w:rFonts w:ascii="Wingdings" w:hAnsi="Wingdings" w:hint="default"/>
+        <w:sz w:val="20"/>
+      </w:rPr>
+    </w:lvl>
+    <w:lvl w:ilvl="8" w:tentative="1">
+      <w:start w:val="1"/>
+      <w:numFmt w:val="bullet"/>
+      <w:lvlText w:val=""/>
+      <w:lvlJc w:val="left"/>
+      <w:pPr>
+        <w:tabs>
+          <w:tab w:val="num" w:pos="6480"/>
+        </w:tabs>
+        <w:ind w:left="6480" w:hanging="360"/>
+      </w:pPr>
+      <w:rPr>
+        <w:rFonts w:ascii="Wingdings" w:hAnsi="Wingdings" w:hint="default"/>
+        <w:sz w:val="20"/>
+      </w:rPr>
+    </w:lvl>
+  </w:abstractNum>
+  <w:abstractNum w:abstractNumId="13" w15:restartNumberingAfterBreak="0">
     <w:nsid w:val="7BE54276"/>
     <w:multiLevelType w:val="multilevel"/>
     <w:tmpl w:val="DD6ABD48"/>
@@ -2071,19 +6204,96 @@
     </w:lvl>
   </w:abstractNum>
   <w:num w:numId="1" w16cid:durableId="1760906571">
+    <w:abstractNumId w:val="4"/>
+  </w:num>
+  <w:num w:numId="2" w16cid:durableId="553811944">
+    <w:abstractNumId w:val="5"/>
+  </w:num>
+  <w:num w:numId="3" w16cid:durableId="2061978545">
+    <w:abstractNumId w:val="13"/>
+  </w:num>
+  <w:num w:numId="4" w16cid:durableId="803544972">
+    <w:abstractNumId w:val="6"/>
+  </w:num>
+  <w:num w:numId="5" w16cid:durableId="1327591426">
+    <w:abstractNumId w:val="8"/>
+  </w:num>
+  <w:num w:numId="6" w16cid:durableId="1496341378">
+    <w:abstractNumId w:val="7"/>
+  </w:num>
+  <w:num w:numId="7" w16cid:durableId="826212842">
+    <w:abstractNumId w:val="7"/>
+    <w:lvlOverride w:ilvl="1">
+      <w:lvl w:ilvl="1">
+        <w:numFmt w:val="decimal"/>
+        <w:lvlText w:val="%2."/>
+        <w:lvlJc w:val="left"/>
+      </w:lvl>
+    </w:lvlOverride>
+  </w:num>
+  <w:num w:numId="8" w16cid:durableId="692807627">
+    <w:abstractNumId w:val="1"/>
+  </w:num>
+  <w:num w:numId="9" w16cid:durableId="528449050">
+    <w:abstractNumId w:val="1"/>
+    <w:lvlOverride w:ilvl="1">
+      <w:lvl w:ilvl="1">
+        <w:numFmt w:val="bullet"/>
+        <w:lvlText w:val="o"/>
+        <w:lvlJc w:val="left"/>
+        <w:pPr>
+          <w:tabs>
+            <w:tab w:val="num" w:pos="1440"/>
+          </w:tabs>
+          <w:ind w:left="1440" w:hanging="360"/>
+        </w:pPr>
+        <w:rPr>
+          <w:rFonts w:ascii="Courier New" w:hAnsi="Courier New" w:hint="default"/>
+          <w:sz w:val="20"/>
+        </w:rPr>
+      </w:lvl>
+    </w:lvlOverride>
+  </w:num>
+  <w:num w:numId="10" w16cid:durableId="735056077">
+    <w:abstractNumId w:val="12"/>
+  </w:num>
+  <w:num w:numId="11" w16cid:durableId="684939036">
+    <w:abstractNumId w:val="12"/>
+    <w:lvlOverride w:ilvl="1">
+      <w:lvl w:ilvl="1">
+        <w:numFmt w:val="bullet"/>
+        <w:lvlText w:val="o"/>
+        <w:lvlJc w:val="left"/>
+        <w:pPr>
+          <w:tabs>
+            <w:tab w:val="num" w:pos="1440"/>
+          </w:tabs>
+          <w:ind w:left="1440" w:hanging="360"/>
+        </w:pPr>
+        <w:rPr>
+          <w:rFonts w:ascii="Courier New" w:hAnsi="Courier New" w:hint="default"/>
+          <w:sz w:val="20"/>
+        </w:rPr>
+      </w:lvl>
+    </w:lvlOverride>
+  </w:num>
+  <w:num w:numId="12" w16cid:durableId="2118787937">
     <w:abstractNumId w:val="0"/>
   </w:num>
-  <w:num w:numId="2" w16cid:durableId="553811944">
-    <w:abstractNumId w:val="1"/>
+  <w:num w:numId="13" w16cid:durableId="205870966">
+    <w:abstractNumId w:val="11"/>
   </w:num>
-  <w:num w:numId="3" w16cid:durableId="2061978545">
-    <w:abstractNumId w:val="4"/>
+  <w:num w:numId="14" w16cid:durableId="1022315270">
+    <w:abstractNumId w:val="9"/>
   </w:num>
-  <w:num w:numId="4" w16cid:durableId="803544972">
+  <w:num w:numId="15" w16cid:durableId="1078938015">
+    <w:abstractNumId w:val="3"/>
+  </w:num>
+  <w:num w:numId="16" w16cid:durableId="1852407180">
     <w:abstractNumId w:val="2"/>
   </w:num>
-  <w:num w:numId="5" w16cid:durableId="1327591426">
-    <w:abstractNumId w:val="3"/>
+  <w:num w:numId="17" w16cid:durableId="702483439">
+    <w:abstractNumId w:val="10"/>
   </w:num>
 </w:numbering>
 </file>
@@ -2691,7 +6901,6 @@
   <w:style w:type="character" w:default="1" w:styleId="Fuentedeprrafopredeter">
     <w:name w:val="Default Paragraph Font"/>
     <w:uiPriority w:val="1"/>
-    <w:semiHidden/>
     <w:unhideWhenUsed/>
   </w:style>
   <w:style w:type="table" w:default="1" w:styleId="Tablanormal">

</xml_diff>